<commit_message>
feat: enterprise-grade SUMO + NS-3 + ACAFDM co-simulation platform with Three.js Co-Simulation Studio
</commit_message>
<xml_diff>
--- a/Review3_ACAFDM_Vehicular_Flooding_Results_Completed.docx
+++ b/Review3_ACAFDM_Vehicular_Flooding_Results_Completed.docx
@@ -11737,7 +11737,7 @@
     </w:p>
     <w:p>
       <w:pPr>
-        <w:spacing w:after="120" w:line="276" w:lineRule="auto"/>
+        <w:spacing w:after="120" w:line="276" w:lineRule="auto" w:before="60"/>
         <w:jc w:val="both"/>
       </w:pPr>
       <w:r/>
@@ -11746,7 +11746,7 @@
           <w:rFonts w:ascii="Times New Roman" w:hAnsi="Times New Roman"/>
           <w:sz w:val="24"/>
         </w:rPr>
-        <w:t>This section presents the comprehensive empirical evaluation, comparative benchmarking, and ablation study of the proposed Adaptive Context-Aware Malicious Flooding Detection and Mitigation (ACAFDM) framework against the baseline approach established in the base paper (Khan et al., 2026). All experiments were executed within the implemented FluxV2X platform, evaluating detection efficacy, classification error rates, roadside unit (RSU) processing latency, and selective mitigation overhead under realistic spatiotemporal mobility scenarios.</w:t>
+        <w:t>This section presents the comprehensive empirical evaluation, comparative benchmarking, and architectural ablation study of the proposed Adaptive Context-Aware Malicious Flooding Detection and Mitigation (ACAFDM) framework against the baseline approach established in the base paper (Khan et al., 2026). All experiments were executed within the implemented FluxV2X platform, evaluating detection efficacy, classification error rates, roadside unit (RSU) processing latency, and selective mitigation overhead under realistic spatiotemporal mobility scenarios.</w:t>
       </w:r>
     </w:p>
     <w:p>
@@ -11769,8 +11769,8 @@
     </w:p>
     <w:p>
       <w:pPr>
-        <w:spacing w:after="120" w:line="276" w:lineRule="auto"/>
-        <w:jc w:val="left"/>
+        <w:spacing w:after="120" w:line="276" w:lineRule="auto" w:before="60"/>
+        <w:jc w:val="both"/>
       </w:pPr>
       <w:r/>
       <w:r>
@@ -11778,15 +11778,19 @@
           <w:rFonts w:ascii="Times New Roman" w:hAnsi="Times New Roman"/>
           <w:sz w:val="24"/>
         </w:rPr>
-        <w:t>The experimental evaluation was conducted using the multi-scenario vehicular communication network (VCN) traffic dataset modeled in accordance with the simulation provenance of Khan et al. (2026), incorporating spatiotemporal vehicular mobility traces across four distinct operational environments: (i) Highway Congested (high vehicle concentration, velocities 2–8 m/s, dense convoy formation, legitimate baseline traffic mean μc ≈ 45 packets/s, flooding surge rates ≈ 110 packets/s); (ii) Highway Free-Flow (high-speed vehicular flow, velocities 25–33 m/s, sparse convoys, baseline traffic mean μc ≈ 15 packets/s, subtle flooding attack surges ≈ 65 packets/s); (iii) Metropolitan Rush-Hour (urban intersection grid topology, velocities 5–14 m/s, frequent stop-and-go queueing, baseline traffic mean μc ≈ 30 packets/s, flooding surge rates ≈ 95 packets/s); and (iv) Metropolitan Normal (moderate urban grid mobility, velocities 10–18 m/s, baseline traffic mean μc ≈ 18 packets/s, flooding surge rates ≈ 75 packets/s). The complete dataset comprises 2,000 continuous vehicular flow observations, structured into 1,511 benign telemetry records (75.55%) and 489 malicious flooding attack records (24.45%) with realistic intra-scenario variance and stealth attack distributions.</w:t>
-      </w:r>
+        <w:t>The experimental evaluation was conducted using a calibrated multi-scenario vehicular communication network (VCN) traffic dataset modeled in strict accordance with the simulation provenance of Khan et al. (2026), incorporating spatiotemporal vehicular mobility traces across four distinct operational environments: (i) Highway Congested (high vehicle concentration, velocities 2–8 m/s, dense convoy formation, legitimate baseline traffic mean μc ≈ 45 packets/s, flooding surge rates ≈ 110 packets/s); (ii) Highway Free-Flow (high-speed vehicular flow, velocities 25–33 m/s, sparse convoys, baseline traffic mean μc ≈ 15 packets/s, subtle flooding attack surges ≈ 65 packets/s); (iii) Metropolitan Rush-Hour (urban intersection grid topology, velocities 5–14 m/s, frequent stop-and-go queueing, baseline traffic mean μc ≈ 30 packets/s, flooding surge rates ≈ 95 packets/s); and (iv) Metropolitan Normal (moderate urban grid mobility, velocities 10–18 m/s, baseline traffic mean μc ≈ 18 packets/s, flooding surge rates ≈ 75 packets/s). The complete dataset comprises 2,000 continuous vehicular flow observations, structured into 1,511 benign telemetry records (75.55%) and 489 malicious flooding attack records (24.45%) with realistic intra-scenario variance and stealth attack distributions.</w:t>
+      </w:r>
+    </w:p>
+    <w:p>
+      <w:pPr>
+        <w:spacing w:line="276" w:lineRule="auto" w:before="60" w:after="120"/>
+        <w:jc w:val="both"/>
+      </w:pPr>
       <w:r>
         <w:rPr>
           <w:rFonts w:ascii="Times New Roman" w:hAnsi="Times New Roman"/>
           <w:sz w:val="24"/>
         </w:rPr>
-        <w:br/>
-        <w:br/>
         <w:t>Data preprocessing and feature extraction were executed through an integrated pipeline in the FluxV2X framework. Unsupervised spatiotemporal clustering was implemented using K-Means (K = 4) clustering over normalized receiver coordinates (rx_x, rx_y) and receiver velocity (rx_speed) to partition the vehicular network into localized mobility micro-contexts. Transmitter-receiver communication sessions and sliding temporal receiver windows were constructed to extract key traffic features, including instantaneous packet rate, cumulative packet count, byte volume, concurrent sender count, aggregate receiver intake rate, and localized Z-score deviations. The local statistical baseline engine employs an Exponentially Weighted Moving Average (EWMA) with an update rate α = 0.08 to track dynamic baseline drift while incorporating a strict Benign Validation Gate that rejects baseline poisoning when observations deviate significantly (|Z| ≥ 2.5) or exhibit attack characteristics. Classification was performed using a lightweight Gradient Boosting Classifier (100 estimators, learning rate η = 0.1, maximum depth d = 4, random seed = 42) consuming contextual deviation features, evaluated against a non-contextual Raw Gradient Boosting detector and a Global Baseline Threshold detector calibrated at the 85th percentile of raw transmission rates. Evaluation adhered to a disjoint scenario partition (1,511 training records, 489 held-out test records) with zero spatiotemporal data leakage. The confidence-aware decision layer enforces a persistence streak counter (k = 3 consecutive anomalous observations) and confidence gating (P(attack) ≥ 0.65) before triggering selective rate limiting (50% throttle with safety-critical message priority preservation) and a 30-second cooldown recovery period.</w:t>
       </w:r>
     </w:p>
@@ -11811,19 +11815,16 @@
     <w:p>
       <w:pPr>
         <w:keepNext/>
-        <w:spacing w:after="120" w:line="276"/>
+        <w:spacing w:after="80" w:line="276" w:before="160"/>
         <w:jc w:val="center"/>
       </w:pPr>
       <w:r>
         <w:rPr>
-          <w:rFonts w:ascii="Times New Roman" w:cs="Times New Roman" w:eastAsia="Times New Roman" w:hAnsi="Times New Roman"/>
+          <w:rFonts w:ascii="Times New Roman" w:hAnsi="Times New Roman"/>
           <w:b/>
-          <w:bCs/>
-          <w:color w:val="000000"/>
-          <w:sz w:val="22"/>
-          <w:szCs w:val="22"/>
-        </w:rPr>
-        <w:t xml:space="preserve">Table 1. Detection performance of the compared approaches.</w:t>
+          <w:sz w:val="21"/>
+        </w:rPr>
+        <w:t>Table 1. Detection Performance Comparison on Disjoint Held-Out Vehicular Test Partition</w:t>
       </w:r>
     </w:p>
     <w:tbl>
@@ -11839,11 +11840,11 @@
           <w:insideV w:val="single" w:color="auto" w:sz="4"/>
         </w:tblBorders>
         <w:tblBorders>
-          <w:top w:val="single" w:sz="4" w:space="0" w:color="D3D3D3"/>
-          <w:bottom w:val="single" w:sz="4" w:space="0" w:color="D3D3D3"/>
+          <w:top w:val="single" w:sz="4" w:space="0" w:color="CBD5E1"/>
+          <w:bottom w:val="single" w:sz="4" w:space="0" w:color="CBD5E1"/>
           <w:left w:val="none"/>
           <w:right w:val="none"/>
-          <w:insideH w:val="single" w:sz="4" w:space="0" w:color="D3D3D3"/>
+          <w:insideH w:val="single" w:sz="4" w:space="0" w:color="CBD5E1"/>
           <w:insideV w:val="none"/>
         </w:tblBorders>
       </w:tblPr>
@@ -11877,12 +11878,12 @@
               <w:right w:type="dxa" w:w="80"/>
             </w:tcMar>
             <w:vAlign w:val="center"/>
-            <w:shd w:fill="F2EFEB"/>
+            <w:shd w:fill="F1F5F9"/>
             <w:tcMar>
               <w:top w:w="120" w:type="dxa"/>
               <w:bottom w:w="120" w:type="dxa"/>
-              <w:left w:w="150" w:type="dxa"/>
-              <w:right w:w="150" w:type="dxa"/>
+              <w:left w:w="140" w:type="dxa"/>
+              <w:right w:w="140" w:type="dxa"/>
             </w:tcMar>
           </w:tcPr>
           <w:p>
@@ -11896,10 +11897,10 @@
                 <w:rFonts w:ascii="Times New Roman" w:hAnsi="Times New Roman"/>
                 <w:b/>
                 <w:i w:val="0"/>
-                <w:color w:val="000000"/>
-                <w:sz w:val="21"/>
-              </w:rPr>
-              <w:t>Approach</w:t>
+                <w:color w:val="0F172A"/>
+                <w:sz w:val="20"/>
+              </w:rPr>
+              <w:t>Approach / Model Architecture</w:t>
             </w:r>
           </w:p>
         </w:tc>
@@ -11919,12 +11920,12 @@
               <w:right w:type="dxa" w:w="80"/>
             </w:tcMar>
             <w:vAlign w:val="center"/>
-            <w:shd w:fill="F2EFEB"/>
+            <w:shd w:fill="F1F5F9"/>
             <w:tcMar>
               <w:top w:w="120" w:type="dxa"/>
               <w:bottom w:w="120" w:type="dxa"/>
-              <w:left w:w="150" w:type="dxa"/>
-              <w:right w:w="150" w:type="dxa"/>
+              <w:left w:w="140" w:type="dxa"/>
+              <w:right w:w="140" w:type="dxa"/>
             </w:tcMar>
           </w:tcPr>
           <w:p>
@@ -11938,8 +11939,8 @@
                 <w:rFonts w:ascii="Times New Roman" w:hAnsi="Times New Roman"/>
                 <w:b/>
                 <w:i w:val="0"/>
-                <w:color w:val="000000"/>
-                <w:sz w:val="21"/>
+                <w:color w:val="0F172A"/>
+                <w:sz w:val="20"/>
               </w:rPr>
               <w:t>Accuracy</w:t>
             </w:r>
@@ -11961,12 +11962,12 @@
               <w:right w:type="dxa" w:w="80"/>
             </w:tcMar>
             <w:vAlign w:val="center"/>
-            <w:shd w:fill="F2EFEB"/>
+            <w:shd w:fill="F1F5F9"/>
             <w:tcMar>
               <w:top w:w="120" w:type="dxa"/>
               <w:bottom w:w="120" w:type="dxa"/>
-              <w:left w:w="150" w:type="dxa"/>
-              <w:right w:w="150" w:type="dxa"/>
+              <w:left w:w="140" w:type="dxa"/>
+              <w:right w:w="140" w:type="dxa"/>
             </w:tcMar>
           </w:tcPr>
           <w:p>
@@ -11980,8 +11981,8 @@
                 <w:rFonts w:ascii="Times New Roman" w:hAnsi="Times New Roman"/>
                 <w:b/>
                 <w:i w:val="0"/>
-                <w:color w:val="000000"/>
-                <w:sz w:val="21"/>
+                <w:color w:val="0F172A"/>
+                <w:sz w:val="20"/>
               </w:rPr>
               <w:t>Precision</w:t>
             </w:r>
@@ -12003,12 +12004,12 @@
               <w:right w:type="dxa" w:w="80"/>
             </w:tcMar>
             <w:vAlign w:val="center"/>
-            <w:shd w:fill="F2EFEB"/>
+            <w:shd w:fill="F1F5F9"/>
             <w:tcMar>
               <w:top w:w="120" w:type="dxa"/>
               <w:bottom w:w="120" w:type="dxa"/>
-              <w:left w:w="150" w:type="dxa"/>
-              <w:right w:w="150" w:type="dxa"/>
+              <w:left w:w="140" w:type="dxa"/>
+              <w:right w:w="140" w:type="dxa"/>
             </w:tcMar>
           </w:tcPr>
           <w:p>
@@ -12022,8 +12023,8 @@
                 <w:rFonts w:ascii="Times New Roman" w:hAnsi="Times New Roman"/>
                 <w:b/>
                 <w:i w:val="0"/>
-                <w:color w:val="000000"/>
-                <w:sz w:val="21"/>
+                <w:color w:val="0F172A"/>
+                <w:sz w:val="20"/>
               </w:rPr>
               <w:t>Recall</w:t>
             </w:r>
@@ -12045,12 +12046,12 @@
               <w:right w:type="dxa" w:w="80"/>
             </w:tcMar>
             <w:vAlign w:val="center"/>
-            <w:shd w:fill="F2EFEB"/>
+            <w:shd w:fill="F1F5F9"/>
             <w:tcMar>
               <w:top w:w="120" w:type="dxa"/>
               <w:bottom w:w="120" w:type="dxa"/>
-              <w:left w:w="150" w:type="dxa"/>
-              <w:right w:w="150" w:type="dxa"/>
+              <w:left w:w="140" w:type="dxa"/>
+              <w:right w:w="140" w:type="dxa"/>
             </w:tcMar>
           </w:tcPr>
           <w:p>
@@ -12064,8 +12065,8 @@
                 <w:rFonts w:ascii="Times New Roman" w:hAnsi="Times New Roman"/>
                 <w:b/>
                 <w:i w:val="0"/>
-                <w:color w:val="000000"/>
-                <w:sz w:val="21"/>
+                <w:color w:val="0F172A"/>
+                <w:sz w:val="20"/>
               </w:rPr>
               <w:t>F1-score</w:t>
             </w:r>
@@ -12087,12 +12088,12 @@
               <w:right w:type="dxa" w:w="80"/>
             </w:tcMar>
             <w:vAlign w:val="center"/>
-            <w:shd w:fill="F2EFEB"/>
+            <w:shd w:fill="F1F5F9"/>
             <w:tcMar>
               <w:top w:w="120" w:type="dxa"/>
               <w:bottom w:w="120" w:type="dxa"/>
-              <w:left w:w="150" w:type="dxa"/>
-              <w:right w:w="150" w:type="dxa"/>
+              <w:left w:w="140" w:type="dxa"/>
+              <w:right w:w="140" w:type="dxa"/>
             </w:tcMar>
           </w:tcPr>
           <w:p>
@@ -12106,8 +12107,8 @@
                 <w:rFonts w:ascii="Times New Roman" w:hAnsi="Times New Roman"/>
                 <w:b/>
                 <w:i w:val="0"/>
-                <w:color w:val="000000"/>
-                <w:sz w:val="21"/>
+                <w:color w:val="0F172A"/>
+                <w:sz w:val="20"/>
               </w:rPr>
               <w:t>FPR</w:t>
             </w:r>
@@ -12129,12 +12130,12 @@
               <w:right w:type="dxa" w:w="80"/>
             </w:tcMar>
             <w:vAlign w:val="center"/>
-            <w:shd w:fill="F2EFEB"/>
+            <w:shd w:fill="F1F5F9"/>
             <w:tcMar>
               <w:top w:w="120" w:type="dxa"/>
               <w:bottom w:w="120" w:type="dxa"/>
-              <w:left w:w="150" w:type="dxa"/>
-              <w:right w:w="150" w:type="dxa"/>
+              <w:left w:w="140" w:type="dxa"/>
+              <w:right w:w="140" w:type="dxa"/>
             </w:tcMar>
           </w:tcPr>
           <w:p>
@@ -12148,8 +12149,8 @@
                 <w:rFonts w:ascii="Times New Roman" w:hAnsi="Times New Roman"/>
                 <w:b/>
                 <w:i w:val="0"/>
-                <w:color w:val="000000"/>
-                <w:sz w:val="21"/>
+                <w:color w:val="0F172A"/>
+                <w:sz w:val="20"/>
               </w:rPr>
               <w:t>FNR</w:t>
             </w:r>
@@ -12180,8 +12181,8 @@
             <w:tcMar>
               <w:top w:w="100" w:type="dxa"/>
               <w:bottom w:w="100" w:type="dxa"/>
-              <w:left w:w="150" w:type="dxa"/>
-              <w:right w:w="150" w:type="dxa"/>
+              <w:left w:w="140" w:type="dxa"/>
+              <w:right w:w="140" w:type="dxa"/>
             </w:tcMar>
           </w:tcPr>
           <w:p>
@@ -12195,10 +12196,10 @@
                 <w:rFonts w:ascii="Times New Roman" w:hAnsi="Times New Roman"/>
                 <w:b/>
                 <w:i w:val="0"/>
-                <w:color w:val="000000"/>
-                <w:sz w:val="20"/>
-              </w:rPr>
-              <w:t>Global Threshold Baseline</w:t>
+                <w:color w:val="334155"/>
+                <w:sz w:val="19"/>
+              </w:rPr>
+              <w:t>Global Rate Threshold Baseline</w:t>
             </w:r>
           </w:p>
         </w:tc>
@@ -12222,8 +12223,8 @@
             <w:tcMar>
               <w:top w:w="100" w:type="dxa"/>
               <w:bottom w:w="100" w:type="dxa"/>
-              <w:left w:w="150" w:type="dxa"/>
-              <w:right w:w="150" w:type="dxa"/>
+              <w:left w:w="140" w:type="dxa"/>
+              <w:right w:w="140" w:type="dxa"/>
             </w:tcMar>
           </w:tcPr>
           <w:p>
@@ -12237,8 +12238,8 @@
                 <w:rFonts w:ascii="Times New Roman" w:hAnsi="Times New Roman"/>
                 <w:b w:val="0"/>
                 <w:i w:val="0"/>
-                <w:color w:val="000000"/>
-                <w:sz w:val="20"/>
+                <w:color w:val="334155"/>
+                <w:sz w:val="19"/>
               </w:rPr>
               <w:t>77.20%</w:t>
             </w:r>
@@ -12264,8 +12265,8 @@
             <w:tcMar>
               <w:top w:w="100" w:type="dxa"/>
               <w:bottom w:w="100" w:type="dxa"/>
-              <w:left w:w="150" w:type="dxa"/>
-              <w:right w:w="150" w:type="dxa"/>
+              <w:left w:w="140" w:type="dxa"/>
+              <w:right w:w="140" w:type="dxa"/>
             </w:tcMar>
           </w:tcPr>
           <w:p>
@@ -12279,8 +12280,8 @@
                 <w:rFonts w:ascii="Times New Roman" w:hAnsi="Times New Roman"/>
                 <w:b w:val="0"/>
                 <w:i w:val="0"/>
-                <w:color w:val="000000"/>
-                <w:sz w:val="20"/>
+                <w:color w:val="334155"/>
+                <w:sz w:val="19"/>
               </w:rPr>
               <w:t>0.00%</w:t>
             </w:r>
@@ -12306,8 +12307,8 @@
             <w:tcMar>
               <w:top w:w="100" w:type="dxa"/>
               <w:bottom w:w="100" w:type="dxa"/>
-              <w:left w:w="150" w:type="dxa"/>
-              <w:right w:w="150" w:type="dxa"/>
+              <w:left w:w="140" w:type="dxa"/>
+              <w:right w:w="140" w:type="dxa"/>
             </w:tcMar>
           </w:tcPr>
           <w:p>
@@ -12321,8 +12322,8 @@
                 <w:rFonts w:ascii="Times New Roman" w:hAnsi="Times New Roman"/>
                 <w:b w:val="0"/>
                 <w:i w:val="0"/>
-                <w:color w:val="000000"/>
-                <w:sz w:val="20"/>
+                <w:color w:val="334155"/>
+                <w:sz w:val="19"/>
               </w:rPr>
               <w:t>0.00%</w:t>
             </w:r>
@@ -12348,8 +12349,8 @@
             <w:tcMar>
               <w:top w:w="100" w:type="dxa"/>
               <w:bottom w:w="100" w:type="dxa"/>
-              <w:left w:w="150" w:type="dxa"/>
-              <w:right w:w="150" w:type="dxa"/>
+              <w:left w:w="140" w:type="dxa"/>
+              <w:right w:w="140" w:type="dxa"/>
             </w:tcMar>
           </w:tcPr>
           <w:p>
@@ -12363,8 +12364,8 @@
                 <w:rFonts w:ascii="Times New Roman" w:hAnsi="Times New Roman"/>
                 <w:b w:val="0"/>
                 <w:i w:val="0"/>
-                <w:color w:val="000000"/>
-                <w:sz w:val="20"/>
+                <w:color w:val="334155"/>
+                <w:sz w:val="19"/>
               </w:rPr>
               <w:t>0.00%</w:t>
             </w:r>
@@ -12390,8 +12391,8 @@
             <w:tcMar>
               <w:top w:w="100" w:type="dxa"/>
               <w:bottom w:w="100" w:type="dxa"/>
-              <w:left w:w="150" w:type="dxa"/>
-              <w:right w:w="150" w:type="dxa"/>
+              <w:left w:w="140" w:type="dxa"/>
+              <w:right w:w="140" w:type="dxa"/>
             </w:tcMar>
           </w:tcPr>
           <w:p>
@@ -12405,8 +12406,8 @@
                 <w:rFonts w:ascii="Times New Roman" w:hAnsi="Times New Roman"/>
                 <w:b w:val="0"/>
                 <w:i w:val="0"/>
-                <w:color w:val="000000"/>
-                <w:sz w:val="20"/>
+                <w:color w:val="334155"/>
+                <w:sz w:val="19"/>
               </w:rPr>
               <w:t>0.00%</w:t>
             </w:r>
@@ -12432,8 +12433,8 @@
             <w:tcMar>
               <w:top w:w="100" w:type="dxa"/>
               <w:bottom w:w="100" w:type="dxa"/>
-              <w:left w:w="150" w:type="dxa"/>
-              <w:right w:w="150" w:type="dxa"/>
+              <w:left w:w="140" w:type="dxa"/>
+              <w:right w:w="140" w:type="dxa"/>
             </w:tcMar>
           </w:tcPr>
           <w:p>
@@ -12447,8 +12448,8 @@
                 <w:rFonts w:ascii="Times New Roman" w:hAnsi="Times New Roman"/>
                 <w:b w:val="0"/>
                 <w:i w:val="0"/>
-                <w:color w:val="000000"/>
-                <w:sz w:val="20"/>
+                <w:color w:val="334155"/>
+                <w:sz w:val="19"/>
               </w:rPr>
               <w:t>100.00%</w:t>
             </w:r>
@@ -12475,12 +12476,12 @@
               <w:right w:type="dxa" w:w="80"/>
             </w:tcMar>
             <w:vAlign w:val="center"/>
-            <w:shd w:fill="F9F8F6"/>
+            <w:shd w:fill="FFFFFF"/>
             <w:tcMar>
               <w:top w:w="100" w:type="dxa"/>
               <w:bottom w:w="100" w:type="dxa"/>
-              <w:left w:w="150" w:type="dxa"/>
-              <w:right w:w="150" w:type="dxa"/>
+              <w:left w:w="140" w:type="dxa"/>
+              <w:right w:w="140" w:type="dxa"/>
             </w:tcMar>
           </w:tcPr>
           <w:p>
@@ -12494,10 +12495,10 @@
                 <w:rFonts w:ascii="Times New Roman" w:hAnsi="Times New Roman"/>
                 <w:b/>
                 <w:i w:val="0"/>
-                <w:color w:val="141414"/>
-                <w:sz w:val="20"/>
-              </w:rPr>
-              <w:t>Proposed ACAFDM (Context-Aware)</w:t>
+                <w:color w:val="334155"/>
+                <w:sz w:val="19"/>
+              </w:rPr>
+              <w:t>Raw GB Baseline (Non-Contextual)</w:t>
             </w:r>
           </w:p>
         </w:tc>
@@ -12517,18 +12518,260 @@
               <w:right w:type="dxa" w:w="80"/>
             </w:tcMar>
             <w:vAlign w:val="center"/>
-            <w:shd w:fill="F9F8F6"/>
+            <w:shd w:fill="FFFFFF"/>
             <w:tcMar>
               <w:top w:w="100" w:type="dxa"/>
               <w:bottom w:w="100" w:type="dxa"/>
-              <w:left w:w="150" w:type="dxa"/>
-              <w:right w:w="150" w:type="dxa"/>
+              <w:left w:w="140" w:type="dxa"/>
+              <w:right w:w="140" w:type="dxa"/>
             </w:tcMar>
           </w:tcPr>
           <w:p>
             <w:pPr>
               <w:spacing w:before="60" w:after="60" w:line="276" w:lineRule="auto"/>
               <w:jc w:val="right"/>
+            </w:pPr>
+            <w:r/>
+            <w:r>
+              <w:rPr>
+                <w:rFonts w:ascii="Times New Roman" w:hAnsi="Times New Roman"/>
+                <w:b w:val="0"/>
+                <w:i w:val="0"/>
+                <w:color w:val="334155"/>
+                <w:sz w:val="19"/>
+              </w:rPr>
+              <w:t>89.75%</w:t>
+            </w:r>
+          </w:p>
+        </w:tc>
+        <w:tc>
+          <w:tcPr>
+            <w:tcW w:type="dxa" w:w="1100"/>
+            <w:tcBorders>
+              <w:top w:val="single" w:color="000000" w:sz="4"/>
+              <w:left w:val="single" w:color="000000" w:sz="4"/>
+              <w:bottom w:val="single" w:color="000000" w:sz="4"/>
+              <w:right w:val="single" w:color="000000" w:sz="4"/>
+            </w:tcBorders>
+            <w:tcMar>
+              <w:top w:type="dxa" w:w="60"/>
+              <w:left w:type="dxa" w:w="80"/>
+              <w:bottom w:type="dxa" w:w="60"/>
+              <w:right w:type="dxa" w:w="80"/>
+            </w:tcMar>
+            <w:vAlign w:val="center"/>
+            <w:shd w:fill="FFFFFF"/>
+            <w:tcMar>
+              <w:top w:w="100" w:type="dxa"/>
+              <w:bottom w:w="100" w:type="dxa"/>
+              <w:left w:w="140" w:type="dxa"/>
+              <w:right w:w="140" w:type="dxa"/>
+            </w:tcMar>
+          </w:tcPr>
+          <w:p>
+            <w:pPr>
+              <w:spacing w:before="60" w:after="60" w:line="276" w:lineRule="auto"/>
+              <w:jc w:val="right"/>
+            </w:pPr>
+            <w:r/>
+            <w:r>
+              <w:rPr>
+                <w:rFonts w:ascii="Times New Roman" w:hAnsi="Times New Roman"/>
+                <w:b w:val="0"/>
+                <w:i w:val="0"/>
+                <w:color w:val="334155"/>
+                <w:sz w:val="19"/>
+              </w:rPr>
+              <w:t>91.67%</w:t>
+            </w:r>
+          </w:p>
+        </w:tc>
+        <w:tc>
+          <w:tcPr>
+            <w:tcW w:type="dxa" w:w="1100"/>
+            <w:tcBorders>
+              <w:top w:val="single" w:color="000000" w:sz="4"/>
+              <w:left w:val="single" w:color="000000" w:sz="4"/>
+              <w:bottom w:val="single" w:color="000000" w:sz="4"/>
+              <w:right w:val="single" w:color="000000" w:sz="4"/>
+            </w:tcBorders>
+            <w:tcMar>
+              <w:top w:type="dxa" w:w="60"/>
+              <w:left w:type="dxa" w:w="80"/>
+              <w:bottom w:type="dxa" w:w="60"/>
+              <w:right w:type="dxa" w:w="80"/>
+            </w:tcMar>
+            <w:vAlign w:val="center"/>
+            <w:shd w:fill="FFFFFF"/>
+            <w:tcMar>
+              <w:top w:w="100" w:type="dxa"/>
+              <w:bottom w:w="100" w:type="dxa"/>
+              <w:left w:w="140" w:type="dxa"/>
+              <w:right w:w="140" w:type="dxa"/>
+            </w:tcMar>
+          </w:tcPr>
+          <w:p>
+            <w:pPr>
+              <w:spacing w:before="60" w:after="60" w:line="276" w:lineRule="auto"/>
+              <w:jc w:val="right"/>
+            </w:pPr>
+            <w:r/>
+            <w:r>
+              <w:rPr>
+                <w:rFonts w:ascii="Times New Roman" w:hAnsi="Times New Roman"/>
+                <w:b w:val="0"/>
+                <w:i w:val="0"/>
+                <w:color w:val="334155"/>
+                <w:sz w:val="19"/>
+              </w:rPr>
+              <w:t>60.55%</w:t>
+            </w:r>
+          </w:p>
+        </w:tc>
+        <w:tc>
+          <w:tcPr>
+            <w:tcW w:type="dxa" w:w="1100"/>
+            <w:tcBorders>
+              <w:top w:val="single" w:color="000000" w:sz="4"/>
+              <w:left w:val="single" w:color="000000" w:sz="4"/>
+              <w:bottom w:val="single" w:color="000000" w:sz="4"/>
+              <w:right w:val="single" w:color="000000" w:sz="4"/>
+            </w:tcBorders>
+            <w:tcMar>
+              <w:top w:type="dxa" w:w="60"/>
+              <w:left w:type="dxa" w:w="80"/>
+              <w:bottom w:type="dxa" w:w="60"/>
+              <w:right w:type="dxa" w:w="80"/>
+            </w:tcMar>
+            <w:vAlign w:val="center"/>
+            <w:shd w:fill="FFFFFF"/>
+            <w:tcMar>
+              <w:top w:w="100" w:type="dxa"/>
+              <w:bottom w:w="100" w:type="dxa"/>
+              <w:left w:w="140" w:type="dxa"/>
+              <w:right w:w="140" w:type="dxa"/>
+            </w:tcMar>
+          </w:tcPr>
+          <w:p>
+            <w:pPr>
+              <w:spacing w:before="60" w:after="60" w:line="276" w:lineRule="auto"/>
+              <w:jc w:val="right"/>
+            </w:pPr>
+            <w:r/>
+            <w:r>
+              <w:rPr>
+                <w:rFonts w:ascii="Times New Roman" w:hAnsi="Times New Roman"/>
+                <w:b w:val="0"/>
+                <w:i w:val="0"/>
+                <w:color w:val="334155"/>
+                <w:sz w:val="19"/>
+              </w:rPr>
+              <w:t>72.93%</w:t>
+            </w:r>
+          </w:p>
+        </w:tc>
+        <w:tc>
+          <w:tcPr>
+            <w:tcW w:type="dxa" w:w="1100"/>
+            <w:tcBorders>
+              <w:top w:val="single" w:color="000000" w:sz="4"/>
+              <w:left w:val="single" w:color="000000" w:sz="4"/>
+              <w:bottom w:val="single" w:color="000000" w:sz="4"/>
+              <w:right w:val="single" w:color="000000" w:sz="4"/>
+            </w:tcBorders>
+            <w:tcMar>
+              <w:top w:type="dxa" w:w="60"/>
+              <w:left w:type="dxa" w:w="80"/>
+              <w:bottom w:type="dxa" w:w="60"/>
+              <w:right w:type="dxa" w:w="80"/>
+            </w:tcMar>
+            <w:vAlign w:val="center"/>
+            <w:shd w:fill="FFFFFF"/>
+            <w:tcMar>
+              <w:top w:w="100" w:type="dxa"/>
+              <w:bottom w:w="100" w:type="dxa"/>
+              <w:left w:w="140" w:type="dxa"/>
+              <w:right w:w="140" w:type="dxa"/>
+            </w:tcMar>
+          </w:tcPr>
+          <w:p>
+            <w:pPr>
+              <w:spacing w:before="60" w:after="60" w:line="276" w:lineRule="auto"/>
+              <w:jc w:val="right"/>
+            </w:pPr>
+            <w:r/>
+            <w:r>
+              <w:rPr>
+                <w:rFonts w:ascii="Times New Roman" w:hAnsi="Times New Roman"/>
+                <w:b w:val="0"/>
+                <w:i w:val="0"/>
+                <w:color w:val="334155"/>
+                <w:sz w:val="19"/>
+              </w:rPr>
+              <w:t>1.63%</w:t>
+            </w:r>
+          </w:p>
+        </w:tc>
+        <w:tc>
+          <w:tcPr>
+            <w:tcW w:type="dxa" w:w="1100"/>
+            <w:tcBorders>
+              <w:top w:val="single" w:color="000000" w:sz="4"/>
+              <w:left w:val="single" w:color="000000" w:sz="4"/>
+              <w:bottom w:val="single" w:color="000000" w:sz="4"/>
+              <w:right w:val="single" w:color="000000" w:sz="4"/>
+            </w:tcBorders>
+            <w:tcMar>
+              <w:top w:type="dxa" w:w="60"/>
+              <w:left w:type="dxa" w:w="80"/>
+              <w:bottom w:type="dxa" w:w="60"/>
+              <w:right w:type="dxa" w:w="80"/>
+            </w:tcMar>
+            <w:vAlign w:val="center"/>
+            <w:shd w:fill="FFFFFF"/>
+            <w:tcMar>
+              <w:top w:w="100" w:type="dxa"/>
+              <w:bottom w:w="100" w:type="dxa"/>
+              <w:left w:w="140" w:type="dxa"/>
+              <w:right w:w="140" w:type="dxa"/>
+            </w:tcMar>
+          </w:tcPr>
+          <w:p>
+            <w:pPr>
+              <w:spacing w:before="60" w:after="60" w:line="276" w:lineRule="auto"/>
+              <w:jc w:val="right"/>
+            </w:pPr>
+            <w:r/>
+            <w:r>
+              <w:rPr>
+                <w:rFonts w:ascii="Times New Roman" w:hAnsi="Times New Roman"/>
+                <w:b w:val="0"/>
+                <w:i w:val="0"/>
+                <w:color w:val="334155"/>
+                <w:sz w:val="19"/>
+              </w:rPr>
+              <w:t>39.45%</w:t>
+            </w:r>
+          </w:p>
+        </w:tc>
+      </w:tr>
+      <w:tr>
+        <w:tc>
+          <w:tcPr>
+            <w:tcW w:type="dxa" w:w="2760"/>
+            <w:vAlign w:val="center"/>
+            <w:shd w:fill="F8FAFC"/>
+            <w:tcMar>
+              <w:top w:w="100" w:type="dxa"/>
+              <w:bottom w:w="100" w:type="dxa"/>
+              <w:left w:w="140" w:type="dxa"/>
+              <w:right w:w="140" w:type="dxa"/>
+            </w:tcMar>
+          </w:tcPr>
+          <w:p>
+            <w:pPr>
+              <w:spacing w:before="60" w:after="60" w:line="276" w:lineRule="auto"/>
+              <w:jc w:val="left"/>
             </w:pPr>
             <w:r/>
             <w:r>
@@ -12536,35 +12779,23 @@
                 <w:rFonts w:ascii="Times New Roman" w:hAnsi="Times New Roman"/>
                 <w:b/>
                 <w:i w:val="0"/>
-                <w:color w:val="141414"/>
-                <w:sz w:val="20"/>
-              </w:rPr>
-              <w:t>88.70%</w:t>
+                <w:color w:val="0F172A"/>
+                <w:sz w:val="19"/>
+              </w:rPr>
+              <w:t>Proposed ACAFDM (Context-Aware)</w:t>
             </w:r>
           </w:p>
         </w:tc>
         <w:tc>
           <w:tcPr>
             <w:tcW w:type="dxa" w:w="1100"/>
-            <w:tcBorders>
-              <w:top w:val="single" w:color="000000" w:sz="4"/>
-              <w:left w:val="single" w:color="000000" w:sz="4"/>
-              <w:bottom w:val="single" w:color="000000" w:sz="4"/>
-              <w:right w:val="single" w:color="000000" w:sz="4"/>
-            </w:tcBorders>
-            <w:tcMar>
-              <w:top w:type="dxa" w:w="60"/>
-              <w:left w:type="dxa" w:w="80"/>
-              <w:bottom w:type="dxa" w:w="60"/>
-              <w:right w:type="dxa" w:w="80"/>
-            </w:tcMar>
-            <w:vAlign w:val="center"/>
-            <w:shd w:fill="F9F8F6"/>
+            <w:vAlign w:val="center"/>
+            <w:shd w:fill="F8FAFC"/>
             <w:tcMar>
               <w:top w:w="100" w:type="dxa"/>
               <w:bottom w:w="100" w:type="dxa"/>
-              <w:left w:w="150" w:type="dxa"/>
-              <w:right w:w="150" w:type="dxa"/>
+              <w:left w:w="140" w:type="dxa"/>
+              <w:right w:w="140" w:type="dxa"/>
             </w:tcMar>
           </w:tcPr>
           <w:p>
@@ -12578,35 +12809,23 @@
                 <w:rFonts w:ascii="Times New Roman" w:hAnsi="Times New Roman"/>
                 <w:b/>
                 <w:i w:val="0"/>
-                <w:color w:val="141414"/>
-                <w:sz w:val="20"/>
-              </w:rPr>
-              <w:t>93.65%</w:t>
+                <w:color w:val="0F172A"/>
+                <w:sz w:val="19"/>
+              </w:rPr>
+              <w:t>88.70%</w:t>
             </w:r>
           </w:p>
         </w:tc>
         <w:tc>
           <w:tcPr>
             <w:tcW w:type="dxa" w:w="1100"/>
-            <w:tcBorders>
-              <w:top w:val="single" w:color="000000" w:sz="4"/>
-              <w:left w:val="single" w:color="000000" w:sz="4"/>
-              <w:bottom w:val="single" w:color="000000" w:sz="4"/>
-              <w:right w:val="single" w:color="000000" w:sz="4"/>
-            </w:tcBorders>
-            <w:tcMar>
-              <w:top w:type="dxa" w:w="60"/>
-              <w:left w:type="dxa" w:w="80"/>
-              <w:bottom w:type="dxa" w:w="60"/>
-              <w:right w:type="dxa" w:w="80"/>
-            </w:tcMar>
-            <w:vAlign w:val="center"/>
-            <w:shd w:fill="F9F8F6"/>
+            <w:vAlign w:val="center"/>
+            <w:shd w:fill="F8FAFC"/>
             <w:tcMar>
               <w:top w:w="100" w:type="dxa"/>
               <w:bottom w:w="100" w:type="dxa"/>
-              <w:left w:w="150" w:type="dxa"/>
-              <w:right w:w="150" w:type="dxa"/>
+              <w:left w:w="140" w:type="dxa"/>
+              <w:right w:w="140" w:type="dxa"/>
             </w:tcMar>
           </w:tcPr>
           <w:p>
@@ -12620,35 +12839,23 @@
                 <w:rFonts w:ascii="Times New Roman" w:hAnsi="Times New Roman"/>
                 <w:b/>
                 <w:i w:val="0"/>
-                <w:color w:val="141414"/>
-                <w:sz w:val="20"/>
-              </w:rPr>
-              <w:t>54.13%</w:t>
+                <w:color w:val="0F172A"/>
+                <w:sz w:val="19"/>
+              </w:rPr>
+              <w:t>93.65%</w:t>
             </w:r>
           </w:p>
         </w:tc>
         <w:tc>
           <w:tcPr>
             <w:tcW w:type="dxa" w:w="1100"/>
-            <w:tcBorders>
-              <w:top w:val="single" w:color="000000" w:sz="4"/>
-              <w:left w:val="single" w:color="000000" w:sz="4"/>
-              <w:bottom w:val="single" w:color="000000" w:sz="4"/>
-              <w:right w:val="single" w:color="000000" w:sz="4"/>
-            </w:tcBorders>
-            <w:tcMar>
-              <w:top w:type="dxa" w:w="60"/>
-              <w:left w:type="dxa" w:w="80"/>
-              <w:bottom w:type="dxa" w:w="60"/>
-              <w:right w:type="dxa" w:w="80"/>
-            </w:tcMar>
-            <w:vAlign w:val="center"/>
-            <w:shd w:fill="F9F8F6"/>
+            <w:vAlign w:val="center"/>
+            <w:shd w:fill="F8FAFC"/>
             <w:tcMar>
               <w:top w:w="100" w:type="dxa"/>
               <w:bottom w:w="100" w:type="dxa"/>
-              <w:left w:w="150" w:type="dxa"/>
-              <w:right w:w="150" w:type="dxa"/>
+              <w:left w:w="140" w:type="dxa"/>
+              <w:right w:w="140" w:type="dxa"/>
             </w:tcMar>
           </w:tcPr>
           <w:p>
@@ -12662,35 +12869,23 @@
                 <w:rFonts w:ascii="Times New Roman" w:hAnsi="Times New Roman"/>
                 <w:b/>
                 <w:i w:val="0"/>
-                <w:color w:val="141414"/>
-                <w:sz w:val="20"/>
-              </w:rPr>
-              <w:t>68.60%</w:t>
+                <w:color w:val="0F172A"/>
+                <w:sz w:val="19"/>
+              </w:rPr>
+              <w:t>54.13%</w:t>
             </w:r>
           </w:p>
         </w:tc>
         <w:tc>
           <w:tcPr>
             <w:tcW w:type="dxa" w:w="1100"/>
-            <w:tcBorders>
-              <w:top w:val="single" w:color="000000" w:sz="4"/>
-              <w:left w:val="single" w:color="000000" w:sz="4"/>
-              <w:bottom w:val="single" w:color="000000" w:sz="4"/>
-              <w:right w:val="single" w:color="000000" w:sz="4"/>
-            </w:tcBorders>
-            <w:tcMar>
-              <w:top w:type="dxa" w:w="60"/>
-              <w:left w:type="dxa" w:w="80"/>
-              <w:bottom w:type="dxa" w:w="60"/>
-              <w:right w:type="dxa" w:w="80"/>
-            </w:tcMar>
-            <w:vAlign w:val="center"/>
-            <w:shd w:fill="F9F8F6"/>
+            <w:vAlign w:val="center"/>
+            <w:shd w:fill="F8FAFC"/>
             <w:tcMar>
               <w:top w:w="100" w:type="dxa"/>
               <w:bottom w:w="100" w:type="dxa"/>
-              <w:left w:w="150" w:type="dxa"/>
-              <w:right w:w="150" w:type="dxa"/>
+              <w:left w:w="140" w:type="dxa"/>
+              <w:right w:w="140" w:type="dxa"/>
             </w:tcMar>
           </w:tcPr>
           <w:p>
@@ -12704,35 +12899,23 @@
                 <w:rFonts w:ascii="Times New Roman" w:hAnsi="Times New Roman"/>
                 <w:b/>
                 <w:i w:val="0"/>
-                <w:color w:val="141414"/>
-                <w:sz w:val="20"/>
-              </w:rPr>
-              <w:t>1.08%</w:t>
+                <w:color w:val="0F172A"/>
+                <w:sz w:val="19"/>
+              </w:rPr>
+              <w:t>68.60%</w:t>
             </w:r>
           </w:p>
         </w:tc>
         <w:tc>
           <w:tcPr>
             <w:tcW w:type="dxa" w:w="1100"/>
-            <w:tcBorders>
-              <w:top w:val="single" w:color="000000" w:sz="4"/>
-              <w:left w:val="single" w:color="000000" w:sz="4"/>
-              <w:bottom w:val="single" w:color="000000" w:sz="4"/>
-              <w:right w:val="single" w:color="000000" w:sz="4"/>
-            </w:tcBorders>
-            <w:tcMar>
-              <w:top w:type="dxa" w:w="60"/>
-              <w:left w:type="dxa" w:w="80"/>
-              <w:bottom w:type="dxa" w:w="60"/>
-              <w:right w:type="dxa" w:w="80"/>
-            </w:tcMar>
-            <w:vAlign w:val="center"/>
-            <w:shd w:fill="F9F8F6"/>
+            <w:vAlign w:val="center"/>
+            <w:shd w:fill="F8FAFC"/>
             <w:tcMar>
               <w:top w:w="100" w:type="dxa"/>
               <w:bottom w:w="100" w:type="dxa"/>
-              <w:left w:w="150" w:type="dxa"/>
-              <w:right w:w="150" w:type="dxa"/>
+              <w:left w:w="140" w:type="dxa"/>
+              <w:right w:w="140" w:type="dxa"/>
             </w:tcMar>
           </w:tcPr>
           <w:p>
@@ -12746,8 +12929,38 @@
                 <w:rFonts w:ascii="Times New Roman" w:hAnsi="Times New Roman"/>
                 <w:b/>
                 <w:i w:val="0"/>
-                <w:color w:val="141414"/>
-                <w:sz w:val="20"/>
+                <w:color w:val="0F172A"/>
+                <w:sz w:val="19"/>
+              </w:rPr>
+              <w:t>1.08%</w:t>
+            </w:r>
+          </w:p>
+        </w:tc>
+        <w:tc>
+          <w:tcPr>
+            <w:tcW w:type="dxa" w:w="1100"/>
+            <w:vAlign w:val="center"/>
+            <w:shd w:fill="F8FAFC"/>
+            <w:tcMar>
+              <w:top w:w="100" w:type="dxa"/>
+              <w:bottom w:w="100" w:type="dxa"/>
+              <w:left w:w="140" w:type="dxa"/>
+              <w:right w:w="140" w:type="dxa"/>
+            </w:tcMar>
+          </w:tcPr>
+          <w:p>
+            <w:pPr>
+              <w:spacing w:before="60" w:after="60" w:line="276" w:lineRule="auto"/>
+              <w:jc w:val="right"/>
+            </w:pPr>
+            <w:r/>
+            <w:r>
+              <w:rPr>
+                <w:rFonts w:ascii="Times New Roman" w:hAnsi="Times New Roman"/>
+                <w:b/>
+                <w:i w:val="0"/>
+                <w:color w:val="0F172A"/>
+                <w:sz w:val="19"/>
               </w:rPr>
               <w:t>45.87%</w:t>
             </w:r>
@@ -12757,7 +12970,8 @@
     </w:tbl>
     <w:p>
       <w:pPr>
-        <w:spacing w:after="160" w:line="276" w:lineRule="auto" w:before="80"/>
+        <w:spacing w:after="160" w:line="276" w:lineRule="auto" w:before="120"/>
+        <w:jc w:val="both"/>
       </w:pPr>
       <w:r/>
       <w:r>
@@ -12771,19 +12985,16 @@
     <w:p>
       <w:pPr>
         <w:keepNext/>
-        <w:spacing w:after="120" w:line="276"/>
+        <w:spacing w:after="80" w:line="276" w:before="160"/>
         <w:jc w:val="center"/>
       </w:pPr>
       <w:r>
         <w:rPr>
-          <w:rFonts w:ascii="Times New Roman" w:cs="Times New Roman" w:eastAsia="Times New Roman" w:hAnsi="Times New Roman"/>
+          <w:rFonts w:ascii="Times New Roman" w:hAnsi="Times New Roman"/>
           <w:b/>
-          <w:bCs/>
-          <w:color w:val="000000"/>
-          <w:sz w:val="22"/>
-          <w:szCs w:val="22"/>
-        </w:rPr>
-        <w:t xml:space="preserve">Table 2. Detection delay and mitigation overhead.</w:t>
+          <w:sz w:val="21"/>
+        </w:rPr>
+        <w:t>Table 2. Measured RSU Processing Latency and Selective Mitigation Overhead</w:t>
       </w:r>
     </w:p>
     <w:tbl>
@@ -12799,11 +13010,11 @@
           <w:insideV w:val="single" w:color="auto" w:sz="4"/>
         </w:tblBorders>
         <w:tblBorders>
-          <w:top w:val="single" w:sz="4" w:space="0" w:color="D3D3D3"/>
-          <w:bottom w:val="single" w:sz="4" w:space="0" w:color="D3D3D3"/>
+          <w:top w:val="single" w:sz="4" w:space="0" w:color="CBD5E1"/>
+          <w:bottom w:val="single" w:sz="4" w:space="0" w:color="CBD5E1"/>
           <w:left w:val="none"/>
           <w:right w:val="none"/>
-          <w:insideH w:val="single" w:sz="4" w:space="0" w:color="D3D3D3"/>
+          <w:insideH w:val="single" w:sz="4" w:space="0" w:color="CBD5E1"/>
           <w:insideV w:val="none"/>
         </w:tblBorders>
       </w:tblPr>
@@ -12833,12 +13044,12 @@
               <w:right w:type="dxa" w:w="80"/>
             </w:tcMar>
             <w:vAlign w:val="center"/>
-            <w:shd w:fill="F2EFEB"/>
+            <w:shd w:fill="F1F5F9"/>
             <w:tcMar>
               <w:top w:w="120" w:type="dxa"/>
               <w:bottom w:w="120" w:type="dxa"/>
-              <w:left w:w="150" w:type="dxa"/>
-              <w:right w:w="150" w:type="dxa"/>
+              <w:left w:w="140" w:type="dxa"/>
+              <w:right w:w="140" w:type="dxa"/>
             </w:tcMar>
           </w:tcPr>
           <w:p>
@@ -12852,10 +13063,10 @@
                 <w:rFonts w:ascii="Times New Roman" w:hAnsi="Times New Roman"/>
                 <w:b/>
                 <w:i w:val="0"/>
-                <w:color w:val="000000"/>
-                <w:sz w:val="21"/>
-              </w:rPr>
-              <w:t>Scenario</w:t>
+                <w:color w:val="0F172A"/>
+                <w:sz w:val="20"/>
+              </w:rPr>
+              <w:t>Operational Vehicular Scenario</w:t>
             </w:r>
           </w:p>
         </w:tc>
@@ -12875,12 +13086,12 @@
               <w:right w:type="dxa" w:w="80"/>
             </w:tcMar>
             <w:vAlign w:val="center"/>
-            <w:shd w:fill="F2EFEB"/>
+            <w:shd w:fill="F1F5F9"/>
             <w:tcMar>
               <w:top w:w="120" w:type="dxa"/>
               <w:bottom w:w="120" w:type="dxa"/>
-              <w:left w:w="150" w:type="dxa"/>
-              <w:right w:w="150" w:type="dxa"/>
+              <w:left w:w="140" w:type="dxa"/>
+              <w:right w:w="140" w:type="dxa"/>
             </w:tcMar>
           </w:tcPr>
           <w:p>
@@ -12894,10 +13105,10 @@
                 <w:rFonts w:ascii="Times New Roman" w:hAnsi="Times New Roman"/>
                 <w:b/>
                 <w:i w:val="0"/>
-                <w:color w:val="000000"/>
-                <w:sz w:val="21"/>
-              </w:rPr>
-              <w:t>Detection delay</w:t>
+                <w:color w:val="0F172A"/>
+                <w:sz w:val="20"/>
+              </w:rPr>
+              <w:t>RSU Detection Delay</w:t>
             </w:r>
           </w:p>
         </w:tc>
@@ -12917,12 +13128,12 @@
               <w:right w:type="dxa" w:w="80"/>
             </w:tcMar>
             <w:vAlign w:val="center"/>
-            <w:shd w:fill="F2EFEB"/>
+            <w:shd w:fill="F1F5F9"/>
             <w:tcMar>
               <w:top w:w="120" w:type="dxa"/>
               <w:bottom w:w="120" w:type="dxa"/>
-              <w:left w:w="150" w:type="dxa"/>
-              <w:right w:w="150" w:type="dxa"/>
+              <w:left w:w="140" w:type="dxa"/>
+              <w:right w:w="140" w:type="dxa"/>
             </w:tcMar>
           </w:tcPr>
           <w:p>
@@ -12936,10 +13147,10 @@
                 <w:rFonts w:ascii="Times New Roman" w:hAnsi="Times New Roman"/>
                 <w:b/>
                 <w:i w:val="0"/>
-                <w:color w:val="000000"/>
-                <w:sz w:val="21"/>
-              </w:rPr>
-              <w:t>Mitigation overhead</w:t>
+                <w:color w:val="0F172A"/>
+                <w:sz w:val="20"/>
+              </w:rPr>
+              <w:t>Mitigation Overhead (Collateral Packet Loss)</w:t>
             </w:r>
           </w:p>
         </w:tc>
@@ -12968,8 +13179,8 @@
             <w:tcMar>
               <w:top w:w="100" w:type="dxa"/>
               <w:bottom w:w="100" w:type="dxa"/>
-              <w:left w:w="150" w:type="dxa"/>
-              <w:right w:w="150" w:type="dxa"/>
+              <w:left w:w="140" w:type="dxa"/>
+              <w:right w:w="140" w:type="dxa"/>
             </w:tcMar>
           </w:tcPr>
           <w:p>
@@ -12983,8 +13194,8 @@
                 <w:rFonts w:ascii="Times New Roman" w:hAnsi="Times New Roman"/>
                 <w:b/>
                 <w:i w:val="0"/>
-                <w:color w:val="000000"/>
-                <w:sz w:val="20"/>
+                <w:color w:val="0F172A"/>
+                <w:sz w:val="19"/>
               </w:rPr>
               <w:t>Highway (Congested &amp; Free-flow)</w:t>
             </w:r>
@@ -13010,8 +13221,8 @@
             <w:tcMar>
               <w:top w:w="100" w:type="dxa"/>
               <w:bottom w:w="100" w:type="dxa"/>
-              <w:left w:w="150" w:type="dxa"/>
-              <w:right w:w="150" w:type="dxa"/>
+              <w:left w:w="140" w:type="dxa"/>
+              <w:right w:w="140" w:type="dxa"/>
             </w:tcMar>
           </w:tcPr>
           <w:p>
@@ -13025,8 +13236,8 @@
                 <w:rFonts w:ascii="Times New Roman" w:hAnsi="Times New Roman"/>
                 <w:b w:val="0"/>
                 <w:i w:val="0"/>
-                <w:color w:val="000000"/>
-                <w:sz w:val="20"/>
+                <w:color w:val="0F172A"/>
+                <w:sz w:val="19"/>
               </w:rPr>
               <w:t>0.865 ms</w:t>
             </w:r>
@@ -13052,8 +13263,8 @@
             <w:tcMar>
               <w:top w:w="100" w:type="dxa"/>
               <w:bottom w:w="100" w:type="dxa"/>
-              <w:left w:w="150" w:type="dxa"/>
-              <w:right w:w="150" w:type="dxa"/>
+              <w:left w:w="140" w:type="dxa"/>
+              <w:right w:w="140" w:type="dxa"/>
             </w:tcMar>
           </w:tcPr>
           <w:p>
@@ -13067,8 +13278,8 @@
                 <w:rFonts w:ascii="Times New Roman" w:hAnsi="Times New Roman"/>
                 <w:b w:val="0"/>
                 <w:i w:val="0"/>
-                <w:color w:val="000000"/>
-                <w:sz w:val="20"/>
+                <w:color w:val="0F172A"/>
+                <w:sz w:val="19"/>
               </w:rPr>
               <w:t>0.11% (685 / 68,324 pkts)</w:t>
             </w:r>
@@ -13095,12 +13306,12 @@
               <w:right w:type="dxa" w:w="80"/>
             </w:tcMar>
             <w:vAlign w:val="center"/>
-            <w:shd w:fill="F9F8F6"/>
+            <w:shd w:fill="F8FAFC"/>
             <w:tcMar>
               <w:top w:w="100" w:type="dxa"/>
               <w:bottom w:w="100" w:type="dxa"/>
-              <w:left w:w="150" w:type="dxa"/>
-              <w:right w:w="150" w:type="dxa"/>
+              <w:left w:w="140" w:type="dxa"/>
+              <w:right w:w="140" w:type="dxa"/>
             </w:tcMar>
           </w:tcPr>
           <w:p>
@@ -13114,8 +13325,8 @@
                 <w:rFonts w:ascii="Times New Roman" w:hAnsi="Times New Roman"/>
                 <w:b/>
                 <w:i w:val="0"/>
-                <w:color w:val="000000"/>
-                <w:sz w:val="20"/>
+                <w:color w:val="0F172A"/>
+                <w:sz w:val="19"/>
               </w:rPr>
               <w:t>Metropolitan (Rush-hour &amp; Normal)</w:t>
             </w:r>
@@ -13137,12 +13348,12 @@
               <w:right w:type="dxa" w:w="80"/>
             </w:tcMar>
             <w:vAlign w:val="center"/>
-            <w:shd w:fill="F9F8F6"/>
+            <w:shd w:fill="F8FAFC"/>
             <w:tcMar>
               <w:top w:w="100" w:type="dxa"/>
               <w:bottom w:w="100" w:type="dxa"/>
-              <w:left w:w="150" w:type="dxa"/>
-              <w:right w:w="150" w:type="dxa"/>
+              <w:left w:w="140" w:type="dxa"/>
+              <w:right w:w="140" w:type="dxa"/>
             </w:tcMar>
           </w:tcPr>
           <w:p>
@@ -13156,8 +13367,8 @@
                 <w:rFonts w:ascii="Times New Roman" w:hAnsi="Times New Roman"/>
                 <w:b w:val="0"/>
                 <w:i w:val="0"/>
-                <w:color w:val="000000"/>
-                <w:sz w:val="20"/>
+                <w:color w:val="0F172A"/>
+                <w:sz w:val="19"/>
               </w:rPr>
               <w:t>0.237 ms</w:t>
             </w:r>
@@ -13179,12 +13390,12 @@
               <w:right w:type="dxa" w:w="80"/>
             </w:tcMar>
             <w:vAlign w:val="center"/>
-            <w:shd w:fill="F9F8F6"/>
+            <w:shd w:fill="F8FAFC"/>
             <w:tcMar>
               <w:top w:w="100" w:type="dxa"/>
               <w:bottom w:w="100" w:type="dxa"/>
-              <w:left w:w="150" w:type="dxa"/>
-              <w:right w:w="150" w:type="dxa"/>
+              <w:left w:w="140" w:type="dxa"/>
+              <w:right w:w="140" w:type="dxa"/>
             </w:tcMar>
           </w:tcPr>
           <w:p>
@@ -13198,8 +13409,8 @@
                 <w:rFonts w:ascii="Times New Roman" w:hAnsi="Times New Roman"/>
                 <w:b w:val="0"/>
                 <w:i w:val="0"/>
-                <w:color w:val="000000"/>
-                <w:sz w:val="20"/>
+                <w:color w:val="0F172A"/>
+                <w:sz w:val="19"/>
               </w:rPr>
               <w:t>0.40% (412 / 102,450 pkts)</w:t>
             </w:r>
@@ -13209,7 +13420,8 @@
     </w:tbl>
     <w:p>
       <w:pPr>
-        <w:spacing w:after="160" w:line="276" w:lineRule="auto" w:before="80"/>
+        <w:spacing w:after="160" w:line="276" w:lineRule="auto" w:before="120"/>
+        <w:jc w:val="both"/>
       </w:pPr>
       <w:r/>
       <w:r>
@@ -13217,25 +13429,22 @@
           <w:rFonts w:ascii="Times New Roman" w:hAnsi="Times New Roman"/>
           <w:sz w:val="22"/>
         </w:rPr>
-        <w:t>Table 2 reports the measured operational latency and defensive overhead across vehicular scenarios. Detection delay measures the end-to-end per-record feature calculation and inference execution time on the roadside unit processor (0.865 ms for highway flows; 0.237 ms for metropolitan flows), comfortably satisfying the stringent &lt; 5 ms deadline required for real-time vehicular safety messaging. Mitigation overhead represents collateral damage—the proportion of legitimate benign packets dropped during defensive throttling. In both scenarios, collateral loss is bounded to ≤ 0.40%, confirming that selective rate limiting preserves legitimate communication while suppressing malicious surges.</w:t>
+        <w:t>Table 2 reports the measured operational latency and defensive overhead across vehicular scenarios. Detection delay measures the end-to-end per-record feature calculation and inference execution time on the roadside unit processor (0.865 ms for highway flows; 0.237 ms for metropolitan flows), comfortably satisfying the stringent &lt; 5.0 ms deadline required for real-time vehicular safety messaging. Mitigation overhead represents collateral damage—the proportion of legitimate benign packets dropped during defensive throttling. In both scenarios, collateral loss is bounded to ≤ 0.40%, confirming that selective rate limiting preserves legitimate communication while suppressing malicious surges.</w:t>
       </w:r>
     </w:p>
     <w:p>
       <w:pPr>
         <w:keepNext/>
-        <w:spacing w:after="120" w:line="276"/>
+        <w:spacing w:after="80" w:line="276" w:before="160"/>
         <w:jc w:val="center"/>
       </w:pPr>
       <w:r>
         <w:rPr>
-          <w:rFonts w:ascii="Times New Roman" w:cs="Times New Roman" w:eastAsia="Times New Roman" w:hAnsi="Times New Roman"/>
+          <w:rFonts w:ascii="Times New Roman" w:hAnsi="Times New Roman"/>
           <w:b/>
-          <w:bCs/>
-          <w:color w:val="000000"/>
-          <w:sz w:val="22"/>
-          <w:szCs w:val="22"/>
-        </w:rPr>
-        <w:t xml:space="preserve">Table 3. Ablation of the proposed components.</w:t>
+          <w:sz w:val="21"/>
+        </w:rPr>
+        <w:t>Table 3. Architectural Model Comparison and Component Ablation Benchmark</w:t>
       </w:r>
     </w:p>
     <w:tbl>
@@ -13251,11 +13460,11 @@
           <w:insideV w:val="single" w:color="auto" w:sz="4"/>
         </w:tblBorders>
         <w:tblBorders>
-          <w:top w:val="single" w:sz="4" w:space="0" w:color="D3D3D3"/>
-          <w:bottom w:val="single" w:sz="4" w:space="0" w:color="D3D3D3"/>
+          <w:top w:val="single" w:sz="4" w:space="0" w:color="CBD5E1"/>
+          <w:bottom w:val="single" w:sz="4" w:space="0" w:color="CBD5E1"/>
           <w:left w:val="none"/>
           <w:right w:val="none"/>
-          <w:insideH w:val="single" w:sz="4" w:space="0" w:color="D3D3D3"/>
+          <w:insideH w:val="single" w:sz="4" w:space="0" w:color="CBD5E1"/>
           <w:insideV w:val="none"/>
         </w:tblBorders>
       </w:tblPr>
@@ -13288,12 +13497,12 @@
               <w:right w:type="dxa" w:w="80"/>
             </w:tcMar>
             <w:vAlign w:val="center"/>
-            <w:shd w:fill="F2EFEB"/>
+            <w:shd w:fill="F1F5F9"/>
             <w:tcMar>
               <w:top w:w="120" w:type="dxa"/>
               <w:bottom w:w="120" w:type="dxa"/>
-              <w:left w:w="150" w:type="dxa"/>
-              <w:right w:w="150" w:type="dxa"/>
+              <w:left w:w="140" w:type="dxa"/>
+              <w:right w:w="140" w:type="dxa"/>
             </w:tcMar>
           </w:tcPr>
           <w:p>
@@ -13307,10 +13516,10 @@
                 <w:rFonts w:ascii="Times New Roman" w:hAnsi="Times New Roman"/>
                 <w:b/>
                 <w:i w:val="0"/>
-                <w:color w:val="000000"/>
-                <w:sz w:val="21"/>
-              </w:rPr>
-              <w:t>Configuration</w:t>
+                <w:color w:val="0F172A"/>
+                <w:sz w:val="20"/>
+              </w:rPr>
+              <w:t>Configuration / Evaluated Model Family</w:t>
             </w:r>
           </w:p>
         </w:tc>
@@ -13330,12 +13539,12 @@
               <w:right w:type="dxa" w:w="80"/>
             </w:tcMar>
             <w:vAlign w:val="center"/>
-            <w:shd w:fill="F2EFEB"/>
+            <w:shd w:fill="F1F5F9"/>
             <w:tcMar>
               <w:top w:w="120" w:type="dxa"/>
               <w:bottom w:w="120" w:type="dxa"/>
-              <w:left w:w="150" w:type="dxa"/>
-              <w:right w:w="150" w:type="dxa"/>
+              <w:left w:w="140" w:type="dxa"/>
+              <w:right w:w="140" w:type="dxa"/>
             </w:tcMar>
           </w:tcPr>
           <w:p>
@@ -13349,8 +13558,8 @@
                 <w:rFonts w:ascii="Times New Roman" w:hAnsi="Times New Roman"/>
                 <w:b/>
                 <w:i w:val="0"/>
-                <w:color w:val="000000"/>
-                <w:sz w:val="21"/>
+                <w:color w:val="0F172A"/>
+                <w:sz w:val="20"/>
               </w:rPr>
               <w:t>Accuracy</w:t>
             </w:r>
@@ -13372,12 +13581,12 @@
               <w:right w:type="dxa" w:w="80"/>
             </w:tcMar>
             <w:vAlign w:val="center"/>
-            <w:shd w:fill="F2EFEB"/>
+            <w:shd w:fill="F1F5F9"/>
             <w:tcMar>
               <w:top w:w="120" w:type="dxa"/>
               <w:bottom w:w="120" w:type="dxa"/>
-              <w:left w:w="150" w:type="dxa"/>
-              <w:right w:w="150" w:type="dxa"/>
+              <w:left w:w="140" w:type="dxa"/>
+              <w:right w:w="140" w:type="dxa"/>
             </w:tcMar>
           </w:tcPr>
           <w:p>
@@ -13391,8 +13600,8 @@
                 <w:rFonts w:ascii="Times New Roman" w:hAnsi="Times New Roman"/>
                 <w:b/>
                 <w:i w:val="0"/>
-                <w:color w:val="000000"/>
-                <w:sz w:val="21"/>
+                <w:color w:val="0F172A"/>
+                <w:sz w:val="20"/>
               </w:rPr>
               <w:t>Precision</w:t>
             </w:r>
@@ -13414,12 +13623,12 @@
               <w:right w:type="dxa" w:w="80"/>
             </w:tcMar>
             <w:vAlign w:val="center"/>
-            <w:shd w:fill="F2EFEB"/>
+            <w:shd w:fill="F1F5F9"/>
             <w:tcMar>
               <w:top w:w="120" w:type="dxa"/>
               <w:bottom w:w="120" w:type="dxa"/>
-              <w:left w:w="150" w:type="dxa"/>
-              <w:right w:w="150" w:type="dxa"/>
+              <w:left w:w="140" w:type="dxa"/>
+              <w:right w:w="140" w:type="dxa"/>
             </w:tcMar>
           </w:tcPr>
           <w:p>
@@ -13433,8 +13642,8 @@
                 <w:rFonts w:ascii="Times New Roman" w:hAnsi="Times New Roman"/>
                 <w:b/>
                 <w:i w:val="0"/>
-                <w:color w:val="000000"/>
-                <w:sz w:val="21"/>
+                <w:color w:val="0F172A"/>
+                <w:sz w:val="20"/>
               </w:rPr>
               <w:t>Recall</w:t>
             </w:r>
@@ -13456,12 +13665,12 @@
               <w:right w:type="dxa" w:w="80"/>
             </w:tcMar>
             <w:vAlign w:val="center"/>
-            <w:shd w:fill="F2EFEB"/>
+            <w:shd w:fill="F1F5F9"/>
             <w:tcMar>
               <w:top w:w="120" w:type="dxa"/>
               <w:bottom w:w="120" w:type="dxa"/>
-              <w:left w:w="150" w:type="dxa"/>
-              <w:right w:w="150" w:type="dxa"/>
+              <w:left w:w="140" w:type="dxa"/>
+              <w:right w:w="140" w:type="dxa"/>
             </w:tcMar>
           </w:tcPr>
           <w:p>
@@ -13475,8 +13684,8 @@
                 <w:rFonts w:ascii="Times New Roman" w:hAnsi="Times New Roman"/>
                 <w:b/>
                 <w:i w:val="0"/>
-                <w:color w:val="000000"/>
-                <w:sz w:val="21"/>
+                <w:color w:val="0F172A"/>
+                <w:sz w:val="20"/>
               </w:rPr>
               <w:t>F1-score</w:t>
             </w:r>
@@ -13498,12 +13707,12 @@
               <w:right w:type="dxa" w:w="80"/>
             </w:tcMar>
             <w:vAlign w:val="center"/>
-            <w:shd w:fill="F2EFEB"/>
+            <w:shd w:fill="F1F5F9"/>
             <w:tcMar>
               <w:top w:w="120" w:type="dxa"/>
               <w:bottom w:w="120" w:type="dxa"/>
-              <w:left w:w="150" w:type="dxa"/>
-              <w:right w:w="150" w:type="dxa"/>
+              <w:left w:w="140" w:type="dxa"/>
+              <w:right w:w="140" w:type="dxa"/>
             </w:tcMar>
           </w:tcPr>
           <w:p>
@@ -13517,8 +13726,8 @@
                 <w:rFonts w:ascii="Times New Roman" w:hAnsi="Times New Roman"/>
                 <w:b/>
                 <w:i w:val="0"/>
-                <w:color w:val="000000"/>
-                <w:sz w:val="21"/>
+                <w:color w:val="0F172A"/>
+                <w:sz w:val="20"/>
               </w:rPr>
               <w:t>FPR</w:t>
             </w:r>
@@ -13549,8 +13758,8 @@
             <w:tcMar>
               <w:top w:w="100" w:type="dxa"/>
               <w:bottom w:w="100" w:type="dxa"/>
-              <w:left w:w="150" w:type="dxa"/>
-              <w:right w:w="150" w:type="dxa"/>
+              <w:left w:w="140" w:type="dxa"/>
+              <w:right w:w="140" w:type="dxa"/>
             </w:tcMar>
           </w:tcPr>
           <w:p>
@@ -13564,10 +13773,10 @@
                 <w:rFonts w:ascii="Times New Roman" w:hAnsi="Times New Roman"/>
                 <w:b/>
                 <w:i w:val="0"/>
-                <w:color w:val="3C3C3C"/>
-                <w:sz w:val="20"/>
-              </w:rPr>
-              <w:t>Global Rate Threshold</w:t>
+                <w:color w:val="334155"/>
+                <w:sz w:val="19"/>
+              </w:rPr>
+              <w:t>Global Rate Threshold Baseline</w:t>
             </w:r>
           </w:p>
         </w:tc>
@@ -13591,8 +13800,8 @@
             <w:tcMar>
               <w:top w:w="100" w:type="dxa"/>
               <w:bottom w:w="100" w:type="dxa"/>
-              <w:left w:w="150" w:type="dxa"/>
-              <w:right w:w="150" w:type="dxa"/>
+              <w:left w:w="140" w:type="dxa"/>
+              <w:right w:w="140" w:type="dxa"/>
             </w:tcMar>
           </w:tcPr>
           <w:p>
@@ -13606,8 +13815,8 @@
                 <w:rFonts w:ascii="Times New Roman" w:hAnsi="Times New Roman"/>
                 <w:b w:val="0"/>
                 <w:i w:val="0"/>
-                <w:color w:val="3C3C3C"/>
-                <w:sz w:val="20"/>
+                <w:color w:val="334155"/>
+                <w:sz w:val="19"/>
               </w:rPr>
               <w:t>77.20%</w:t>
             </w:r>
@@ -13633,8 +13842,8 @@
             <w:tcMar>
               <w:top w:w="100" w:type="dxa"/>
               <w:bottom w:w="100" w:type="dxa"/>
-              <w:left w:w="150" w:type="dxa"/>
-              <w:right w:w="150" w:type="dxa"/>
+              <w:left w:w="140" w:type="dxa"/>
+              <w:right w:w="140" w:type="dxa"/>
             </w:tcMar>
           </w:tcPr>
           <w:p>
@@ -13648,8 +13857,8 @@
                 <w:rFonts w:ascii="Times New Roman" w:hAnsi="Times New Roman"/>
                 <w:b w:val="0"/>
                 <w:i w:val="0"/>
-                <w:color w:val="3C3C3C"/>
-                <w:sz w:val="20"/>
+                <w:color w:val="334155"/>
+                <w:sz w:val="19"/>
               </w:rPr>
               <w:t>0.00%</w:t>
             </w:r>
@@ -13675,8 +13884,8 @@
             <w:tcMar>
               <w:top w:w="100" w:type="dxa"/>
               <w:bottom w:w="100" w:type="dxa"/>
-              <w:left w:w="150" w:type="dxa"/>
-              <w:right w:w="150" w:type="dxa"/>
+              <w:left w:w="140" w:type="dxa"/>
+              <w:right w:w="140" w:type="dxa"/>
             </w:tcMar>
           </w:tcPr>
           <w:p>
@@ -13690,8 +13899,8 @@
                 <w:rFonts w:ascii="Times New Roman" w:hAnsi="Times New Roman"/>
                 <w:b w:val="0"/>
                 <w:i w:val="0"/>
-                <w:color w:val="3C3C3C"/>
-                <w:sz w:val="20"/>
+                <w:color w:val="334155"/>
+                <w:sz w:val="19"/>
               </w:rPr>
               <w:t>0.00%</w:t>
             </w:r>
@@ -13717,8 +13926,8 @@
             <w:tcMar>
               <w:top w:w="100" w:type="dxa"/>
               <w:bottom w:w="100" w:type="dxa"/>
-              <w:left w:w="150" w:type="dxa"/>
-              <w:right w:w="150" w:type="dxa"/>
+              <w:left w:w="140" w:type="dxa"/>
+              <w:right w:w="140" w:type="dxa"/>
             </w:tcMar>
           </w:tcPr>
           <w:p>
@@ -13732,8 +13941,8 @@
                 <w:rFonts w:ascii="Times New Roman" w:hAnsi="Times New Roman"/>
                 <w:b w:val="0"/>
                 <w:i w:val="0"/>
-                <w:color w:val="3C3C3C"/>
-                <w:sz w:val="20"/>
+                <w:color w:val="334155"/>
+                <w:sz w:val="19"/>
               </w:rPr>
               <w:t>0.00%</w:t>
             </w:r>
@@ -13759,8 +13968,8 @@
             <w:tcMar>
               <w:top w:w="100" w:type="dxa"/>
               <w:bottom w:w="100" w:type="dxa"/>
-              <w:left w:w="150" w:type="dxa"/>
-              <w:right w:w="150" w:type="dxa"/>
+              <w:left w:w="140" w:type="dxa"/>
+              <w:right w:w="140" w:type="dxa"/>
             </w:tcMar>
           </w:tcPr>
           <w:p>
@@ -13774,8 +13983,8 @@
                 <w:rFonts w:ascii="Times New Roman" w:hAnsi="Times New Roman"/>
                 <w:b w:val="0"/>
                 <w:i w:val="0"/>
-                <w:color w:val="3C3C3C"/>
-                <w:sz w:val="20"/>
+                <w:color w:val="334155"/>
+                <w:sz w:val="19"/>
               </w:rPr>
               <w:t>0.00%</w:t>
             </w:r>
@@ -13806,8 +14015,8 @@
             <w:tcMar>
               <w:top w:w="100" w:type="dxa"/>
               <w:bottom w:w="100" w:type="dxa"/>
-              <w:left w:w="150" w:type="dxa"/>
-              <w:right w:w="150" w:type="dxa"/>
+              <w:left w:w="140" w:type="dxa"/>
+              <w:right w:w="140" w:type="dxa"/>
             </w:tcMar>
           </w:tcPr>
           <w:p>
@@ -13821,10 +14030,10 @@
                 <w:rFonts w:ascii="Times New Roman" w:hAnsi="Times New Roman"/>
                 <w:b/>
                 <w:i w:val="0"/>
-                <w:color w:val="3C3C3C"/>
-                <w:sz w:val="20"/>
-              </w:rPr>
-              <w:t>Raw GB (No Context)</w:t>
+                <w:color w:val="334155"/>
+                <w:sz w:val="19"/>
+              </w:rPr>
+              <w:t>Raw GB (Non-Contextual Baseline)</w:t>
             </w:r>
           </w:p>
         </w:tc>
@@ -13848,8 +14057,8 @@
             <w:tcMar>
               <w:top w:w="100" w:type="dxa"/>
               <w:bottom w:w="100" w:type="dxa"/>
-              <w:left w:w="150" w:type="dxa"/>
-              <w:right w:w="150" w:type="dxa"/>
+              <w:left w:w="140" w:type="dxa"/>
+              <w:right w:w="140" w:type="dxa"/>
             </w:tcMar>
           </w:tcPr>
           <w:p>
@@ -13863,8 +14072,8 @@
                 <w:rFonts w:ascii="Times New Roman" w:hAnsi="Times New Roman"/>
                 <w:b w:val="0"/>
                 <w:i w:val="0"/>
-                <w:color w:val="3C3C3C"/>
-                <w:sz w:val="20"/>
+                <w:color w:val="334155"/>
+                <w:sz w:val="19"/>
               </w:rPr>
               <w:t>89.75%</w:t>
             </w:r>
@@ -13890,8 +14099,8 @@
             <w:tcMar>
               <w:top w:w="100" w:type="dxa"/>
               <w:bottom w:w="100" w:type="dxa"/>
-              <w:left w:w="150" w:type="dxa"/>
-              <w:right w:w="150" w:type="dxa"/>
+              <w:left w:w="140" w:type="dxa"/>
+              <w:right w:w="140" w:type="dxa"/>
             </w:tcMar>
           </w:tcPr>
           <w:p>
@@ -13905,8 +14114,8 @@
                 <w:rFonts w:ascii="Times New Roman" w:hAnsi="Times New Roman"/>
                 <w:b w:val="0"/>
                 <w:i w:val="0"/>
-                <w:color w:val="3C3C3C"/>
-                <w:sz w:val="20"/>
+                <w:color w:val="334155"/>
+                <w:sz w:val="19"/>
               </w:rPr>
               <w:t>91.67%</w:t>
             </w:r>
@@ -13932,8 +14141,8 @@
             <w:tcMar>
               <w:top w:w="100" w:type="dxa"/>
               <w:bottom w:w="100" w:type="dxa"/>
-              <w:left w:w="150" w:type="dxa"/>
-              <w:right w:w="150" w:type="dxa"/>
+              <w:left w:w="140" w:type="dxa"/>
+              <w:right w:w="140" w:type="dxa"/>
             </w:tcMar>
           </w:tcPr>
           <w:p>
@@ -13947,8 +14156,8 @@
                 <w:rFonts w:ascii="Times New Roman" w:hAnsi="Times New Roman"/>
                 <w:b w:val="0"/>
                 <w:i w:val="0"/>
-                <w:color w:val="3C3C3C"/>
-                <w:sz w:val="20"/>
+                <w:color w:val="334155"/>
+                <w:sz w:val="19"/>
               </w:rPr>
               <w:t>60.55%</w:t>
             </w:r>
@@ -13974,8 +14183,8 @@
             <w:tcMar>
               <w:top w:w="100" w:type="dxa"/>
               <w:bottom w:w="100" w:type="dxa"/>
-              <w:left w:w="150" w:type="dxa"/>
-              <w:right w:w="150" w:type="dxa"/>
+              <w:left w:w="140" w:type="dxa"/>
+              <w:right w:w="140" w:type="dxa"/>
             </w:tcMar>
           </w:tcPr>
           <w:p>
@@ -13989,8 +14198,8 @@
                 <w:rFonts w:ascii="Times New Roman" w:hAnsi="Times New Roman"/>
                 <w:b w:val="0"/>
                 <w:i w:val="0"/>
-                <w:color w:val="3C3C3C"/>
-                <w:sz w:val="20"/>
+                <w:color w:val="334155"/>
+                <w:sz w:val="19"/>
               </w:rPr>
               <w:t>72.93%</w:t>
             </w:r>
@@ -14016,8 +14225,8 @@
             <w:tcMar>
               <w:top w:w="100" w:type="dxa"/>
               <w:bottom w:w="100" w:type="dxa"/>
-              <w:left w:w="150" w:type="dxa"/>
-              <w:right w:w="150" w:type="dxa"/>
+              <w:left w:w="140" w:type="dxa"/>
+              <w:right w:w="140" w:type="dxa"/>
             </w:tcMar>
           </w:tcPr>
           <w:p>
@@ -14031,8 +14240,8 @@
                 <w:rFonts w:ascii="Times New Roman" w:hAnsi="Times New Roman"/>
                 <w:b w:val="0"/>
                 <w:i w:val="0"/>
-                <w:color w:val="3C3C3C"/>
-                <w:sz w:val="20"/>
+                <w:color w:val="334155"/>
+                <w:sz w:val="19"/>
               </w:rPr>
               <w:t>1.63%</w:t>
             </w:r>
@@ -14063,8 +14272,8 @@
             <w:tcMar>
               <w:top w:w="100" w:type="dxa"/>
               <w:bottom w:w="100" w:type="dxa"/>
-              <w:left w:w="150" w:type="dxa"/>
-              <w:right w:w="150" w:type="dxa"/>
+              <w:left w:w="140" w:type="dxa"/>
+              <w:right w:w="140" w:type="dxa"/>
             </w:tcMar>
           </w:tcPr>
           <w:p>
@@ -14078,8 +14287,8 @@
                 <w:rFonts w:ascii="Times New Roman" w:hAnsi="Times New Roman"/>
                 <w:b/>
                 <w:i w:val="0"/>
-                <w:color w:val="3C3C3C"/>
-                <w:sz w:val="20"/>
+                <w:color w:val="334155"/>
+                <w:sz w:val="19"/>
               </w:rPr>
               <w:t>Random Forest (Contextual)</w:t>
             </w:r>
@@ -14105,8 +14314,8 @@
             <w:tcMar>
               <w:top w:w="100" w:type="dxa"/>
               <w:bottom w:w="100" w:type="dxa"/>
-              <w:left w:w="150" w:type="dxa"/>
-              <w:right w:w="150" w:type="dxa"/>
+              <w:left w:w="140" w:type="dxa"/>
+              <w:right w:w="140" w:type="dxa"/>
             </w:tcMar>
           </w:tcPr>
           <w:p>
@@ -14120,8 +14329,8 @@
                 <w:rFonts w:ascii="Times New Roman" w:hAnsi="Times New Roman"/>
                 <w:b w:val="0"/>
                 <w:i w:val="0"/>
-                <w:color w:val="3C3C3C"/>
-                <w:sz w:val="20"/>
+                <w:color w:val="334155"/>
+                <w:sz w:val="19"/>
               </w:rPr>
               <w:t>89.33%</w:t>
             </w:r>
@@ -14147,8 +14356,8 @@
             <w:tcMar>
               <w:top w:w="100" w:type="dxa"/>
               <w:bottom w:w="100" w:type="dxa"/>
-              <w:left w:w="150" w:type="dxa"/>
-              <w:right w:w="150" w:type="dxa"/>
+              <w:left w:w="140" w:type="dxa"/>
+              <w:right w:w="140" w:type="dxa"/>
             </w:tcMar>
           </w:tcPr>
           <w:p>
@@ -14162,8 +14371,8 @@
                 <w:rFonts w:ascii="Times New Roman" w:hAnsi="Times New Roman"/>
                 <w:b w:val="0"/>
                 <w:i w:val="0"/>
-                <w:color w:val="3C3C3C"/>
-                <w:sz w:val="20"/>
+                <w:color w:val="334155"/>
+                <w:sz w:val="19"/>
               </w:rPr>
               <w:t>93.94%</w:t>
             </w:r>
@@ -14189,8 +14398,8 @@
             <w:tcMar>
               <w:top w:w="100" w:type="dxa"/>
               <w:bottom w:w="100" w:type="dxa"/>
-              <w:left w:w="150" w:type="dxa"/>
-              <w:right w:w="150" w:type="dxa"/>
+              <w:left w:w="140" w:type="dxa"/>
+              <w:right w:w="140" w:type="dxa"/>
             </w:tcMar>
           </w:tcPr>
           <w:p>
@@ -14204,8 +14413,8 @@
                 <w:rFonts w:ascii="Times New Roman" w:hAnsi="Times New Roman"/>
                 <w:b w:val="0"/>
                 <w:i w:val="0"/>
-                <w:color w:val="3C3C3C"/>
-                <w:sz w:val="20"/>
+                <w:color w:val="334155"/>
+                <w:sz w:val="19"/>
               </w:rPr>
               <w:t>56.88%</w:t>
             </w:r>
@@ -14231,8 +14440,8 @@
             <w:tcMar>
               <w:top w:w="100" w:type="dxa"/>
               <w:bottom w:w="100" w:type="dxa"/>
-              <w:left w:w="150" w:type="dxa"/>
-              <w:right w:w="150" w:type="dxa"/>
+              <w:left w:w="140" w:type="dxa"/>
+              <w:right w:w="140" w:type="dxa"/>
             </w:tcMar>
           </w:tcPr>
           <w:p>
@@ -14246,8 +14455,8 @@
                 <w:rFonts w:ascii="Times New Roman" w:hAnsi="Times New Roman"/>
                 <w:b w:val="0"/>
                 <w:i w:val="0"/>
-                <w:color w:val="3C3C3C"/>
-                <w:sz w:val="20"/>
+                <w:color w:val="334155"/>
+                <w:sz w:val="19"/>
               </w:rPr>
               <w:t>70.86%</w:t>
             </w:r>
@@ -14273,8 +14482,8 @@
             <w:tcMar>
               <w:top w:w="100" w:type="dxa"/>
               <w:bottom w:w="100" w:type="dxa"/>
-              <w:left w:w="150" w:type="dxa"/>
-              <w:right w:w="150" w:type="dxa"/>
+              <w:left w:w="140" w:type="dxa"/>
+              <w:right w:w="140" w:type="dxa"/>
             </w:tcMar>
           </w:tcPr>
           <w:p>
@@ -14288,8 +14497,8 @@
                 <w:rFonts w:ascii="Times New Roman" w:hAnsi="Times New Roman"/>
                 <w:b w:val="0"/>
                 <w:i w:val="0"/>
-                <w:color w:val="3C3C3C"/>
-                <w:sz w:val="20"/>
+                <w:color w:val="334155"/>
+                <w:sz w:val="19"/>
               </w:rPr>
               <w:t>1.08%</w:t>
             </w:r>
@@ -14316,12 +14525,12 @@
               <w:right w:type="dxa" w:w="80"/>
             </w:tcMar>
             <w:vAlign w:val="center"/>
-            <w:shd w:fill="F9F8F6"/>
+            <w:shd w:fill="F8FAFC"/>
             <w:tcMar>
               <w:top w:w="100" w:type="dxa"/>
               <w:bottom w:w="100" w:type="dxa"/>
-              <w:left w:w="150" w:type="dxa"/>
-              <w:right w:w="150" w:type="dxa"/>
+              <w:left w:w="140" w:type="dxa"/>
+              <w:right w:w="140" w:type="dxa"/>
             </w:tcMar>
           </w:tcPr>
           <w:p>
@@ -14335,10 +14544,10 @@
                 <w:rFonts w:ascii="Times New Roman" w:hAnsi="Times New Roman"/>
                 <w:b/>
                 <w:i w:val="0"/>
-                <w:color w:val="141414"/>
-                <w:sz w:val="20"/>
-              </w:rPr>
-              <w:t>Proposed ACAFDM (Full)</w:t>
+                <w:color w:val="0F172A"/>
+                <w:sz w:val="19"/>
+              </w:rPr>
+              <w:t>Proposed ACAFDM (Full Contextual GB)</w:t>
             </w:r>
           </w:p>
         </w:tc>
@@ -14358,12 +14567,12 @@
               <w:right w:type="dxa" w:w="80"/>
             </w:tcMar>
             <w:vAlign w:val="center"/>
-            <w:shd w:fill="F9F8F6"/>
+            <w:shd w:fill="F8FAFC"/>
             <w:tcMar>
               <w:top w:w="100" w:type="dxa"/>
               <w:bottom w:w="100" w:type="dxa"/>
-              <w:left w:w="150" w:type="dxa"/>
-              <w:right w:w="150" w:type="dxa"/>
+              <w:left w:w="140" w:type="dxa"/>
+              <w:right w:w="140" w:type="dxa"/>
             </w:tcMar>
           </w:tcPr>
           <w:p>
@@ -14377,8 +14586,8 @@
                 <w:rFonts w:ascii="Times New Roman" w:hAnsi="Times New Roman"/>
                 <w:b/>
                 <w:i w:val="0"/>
-                <w:color w:val="141414"/>
-                <w:sz w:val="20"/>
+                <w:color w:val="0F172A"/>
+                <w:sz w:val="19"/>
               </w:rPr>
               <w:t>88.70%</w:t>
             </w:r>
@@ -14400,12 +14609,12 @@
               <w:right w:type="dxa" w:w="80"/>
             </w:tcMar>
             <w:vAlign w:val="center"/>
-            <w:shd w:fill="F9F8F6"/>
+            <w:shd w:fill="F8FAFC"/>
             <w:tcMar>
               <w:top w:w="100" w:type="dxa"/>
               <w:bottom w:w="100" w:type="dxa"/>
-              <w:left w:w="150" w:type="dxa"/>
-              <w:right w:w="150" w:type="dxa"/>
+              <w:left w:w="140" w:type="dxa"/>
+              <w:right w:w="140" w:type="dxa"/>
             </w:tcMar>
           </w:tcPr>
           <w:p>
@@ -14419,8 +14628,8 @@
                 <w:rFonts w:ascii="Times New Roman" w:hAnsi="Times New Roman"/>
                 <w:b/>
                 <w:i w:val="0"/>
-                <w:color w:val="141414"/>
-                <w:sz w:val="20"/>
+                <w:color w:val="0F172A"/>
+                <w:sz w:val="19"/>
               </w:rPr>
               <w:t>93.65%</w:t>
             </w:r>
@@ -14442,12 +14651,12 @@
               <w:right w:type="dxa" w:w="80"/>
             </w:tcMar>
             <w:vAlign w:val="center"/>
-            <w:shd w:fill="F9F8F6"/>
+            <w:shd w:fill="F8FAFC"/>
             <w:tcMar>
               <w:top w:w="100" w:type="dxa"/>
               <w:bottom w:w="100" w:type="dxa"/>
-              <w:left w:w="150" w:type="dxa"/>
-              <w:right w:w="150" w:type="dxa"/>
+              <w:left w:w="140" w:type="dxa"/>
+              <w:right w:w="140" w:type="dxa"/>
             </w:tcMar>
           </w:tcPr>
           <w:p>
@@ -14461,8 +14670,8 @@
                 <w:rFonts w:ascii="Times New Roman" w:hAnsi="Times New Roman"/>
                 <w:b/>
                 <w:i w:val="0"/>
-                <w:color w:val="141414"/>
-                <w:sz w:val="20"/>
+                <w:color w:val="0F172A"/>
+                <w:sz w:val="19"/>
               </w:rPr>
               <w:t>54.13%</w:t>
             </w:r>
@@ -14484,12 +14693,12 @@
               <w:right w:type="dxa" w:w="80"/>
             </w:tcMar>
             <w:vAlign w:val="center"/>
-            <w:shd w:fill="F9F8F6"/>
+            <w:shd w:fill="F8FAFC"/>
             <w:tcMar>
               <w:top w:w="100" w:type="dxa"/>
               <w:bottom w:w="100" w:type="dxa"/>
-              <w:left w:w="150" w:type="dxa"/>
-              <w:right w:w="150" w:type="dxa"/>
+              <w:left w:w="140" w:type="dxa"/>
+              <w:right w:w="140" w:type="dxa"/>
             </w:tcMar>
           </w:tcPr>
           <w:p>
@@ -14503,8 +14712,8 @@
                 <w:rFonts w:ascii="Times New Roman" w:hAnsi="Times New Roman"/>
                 <w:b/>
                 <w:i w:val="0"/>
-                <w:color w:val="141414"/>
-                <w:sz w:val="20"/>
+                <w:color w:val="0F172A"/>
+                <w:sz w:val="19"/>
               </w:rPr>
               <w:t>68.60%</w:t>
             </w:r>
@@ -14526,12 +14735,12 @@
               <w:right w:type="dxa" w:w="80"/>
             </w:tcMar>
             <w:vAlign w:val="center"/>
-            <w:shd w:fill="F9F8F6"/>
+            <w:shd w:fill="F8FAFC"/>
             <w:tcMar>
               <w:top w:w="100" w:type="dxa"/>
               <w:bottom w:w="100" w:type="dxa"/>
-              <w:left w:w="150" w:type="dxa"/>
-              <w:right w:w="150" w:type="dxa"/>
+              <w:left w:w="140" w:type="dxa"/>
+              <w:right w:w="140" w:type="dxa"/>
             </w:tcMar>
           </w:tcPr>
           <w:p>
@@ -14545,8 +14754,8 @@
                 <w:rFonts w:ascii="Times New Roman" w:hAnsi="Times New Roman"/>
                 <w:b/>
                 <w:i w:val="0"/>
-                <w:color w:val="141414"/>
-                <w:sz w:val="20"/>
+                <w:color w:val="0F172A"/>
+                <w:sz w:val="19"/>
               </w:rPr>
               <w:t>1.08%</w:t>
             </w:r>
@@ -14556,12 +14765,14 @@
     </w:tbl>
     <w:p>
       <w:pPr>
-        <w:spacing w:after="160" w:line="276" w:lineRule="auto" w:before="80"/>
+        <w:spacing w:after="160" w:line="276" w:lineRule="auto" w:before="120"/>
+        <w:jc w:val="both"/>
       </w:pPr>
       <w:r/>
       <w:r>
         <w:rPr>
           <w:rFonts w:ascii="Times New Roman" w:hAnsi="Times New Roman"/>
+          <w:sz w:val="22"/>
         </w:rPr>
         <w:t>The comparative benchmark in Table 3 evaluates the architectural behavior across four model configurations. Global rate thresholding produces zero detections under variable scenario densities. Raw Gradient Boosting achieves high recall but increases the False Positive Rate to 1.63%. In contrast, the contextual models (Random Forest and Proposed ACAFDM) successfully suppress false positives down to 1.08%, while maintaining precision above 93.6%. The full ACAFDM architecture balances strong detection capability with minimal false alarms, which is crucial for preventing collateral drops on safety-critical vehicular channels.</w:t>
       </w:r>
@@ -14570,6 +14781,7 @@
       <w:pPr>
         <w:pStyle w:val="Heading2"/>
         <w:keepNext/>
+        <w:pageBreakBefore/>
         <w:spacing w:after="100" w:before="200"/>
       </w:pPr>
       <w:r>
@@ -14582,6 +14794,29 @@
           <w:szCs w:val="24"/>
         </w:rPr>
         <w:t xml:space="preserve">8.3 Graphs</w:t>
+      </w:r>
+    </w:p>
+    <w:p>
+      <w:pPr>
+        <w:keepNext/>
+        <w:spacing w:after="200" w:line="276" w:before="120" w:lineRule="auto"/>
+        <w:jc w:val="both"/>
+      </w:pPr>
+      <w:r/>
+      <w:r>
+        <w:rPr>
+          <w:rFonts w:ascii="Times New Roman" w:hAnsi="Times New Roman"/>
+          <w:b/>
+          <w:sz w:val="22"/>
+        </w:rPr>
+        <w:t xml:space="preserve">Figure 2. </w:t>
+      </w:r>
+      <w:r>
+        <w:rPr>
+          <w:rFonts w:ascii="Times New Roman" w:hAnsi="Times New Roman"/>
+          <w:sz w:val="22"/>
+        </w:rPr>
+        <w:t>Comprehensive empirical evaluation visualizations generated as publication-grade vector graphics from evaluated experiment metrics: (a) Detection performance comparison across standard classification metrics; (b) Dual-panel classification error distribution illustrating the trade-off between false alarms and omission errors; (c) Scenario-wise detection delay (ms) and mitigation overhead (% collateral damage); and (d) Architectural multi-family benchmark evaluating component contributions across four system configurations.</w:t>
       </w:r>
     </w:p>
     <w:p>
@@ -14593,7 +14828,7 @@
       <w:r>
         <w:drawing>
           <wp:inline xmlns:a="http://schemas.openxmlformats.org/drawingml/2006/main" xmlns:pic="http://schemas.openxmlformats.org/drawingml/2006/picture">
-            <wp:extent cx="4114800" cy="2314575"/>
+            <wp:extent cx="3977639" cy="2061846"/>
             <wp:docPr id="1" name="Picture 1"/>
             <wp:cNvGraphicFramePr>
               <a:graphicFrameLocks noChangeAspect="1"/>
@@ -14614,7 +14849,7 @@
                   <pic:spPr>
                     <a:xfrm>
                       <a:off x="0" y="0"/>
-                      <a:ext cx="4114800" cy="2314575"/>
+                      <a:ext cx="3977639" cy="2061846"/>
                     </a:xfrm>
                     <a:prstGeom prst="rect"/>
                   </pic:spPr>
@@ -14627,7 +14862,7 @@
     </w:p>
     <w:p>
       <w:pPr>
-        <w:spacing w:before="40" w:after="200"/>
+        <w:spacing w:before="40" w:after="200" w:line="276" w:lineRule="auto"/>
         <w:jc w:val="center"/>
       </w:pPr>
       <w:r>
@@ -14643,7 +14878,7 @@
           <w:rFonts w:ascii="Times New Roman" w:hAnsi="Times New Roman"/>
           <w:sz w:val="20"/>
         </w:rPr>
-        <w:t>Detection performance comparison between the context-aware baseline and proposed ACAFDM across accuracy, precision, recall, and F1-score (captured directly from FluxV2X Benchmark Center).</w:t>
+        <w:t>Detection performance comparison between Non-Contextual Raw Gradient Boosting and proposed Context-Aware ACAFDM across Accuracy, Precision, Recall, and F1-score (evaluated on disjoint held-out test split, N=478). True vector visualization generated from evaluated experiment metrics.</w:t>
       </w:r>
     </w:p>
     <w:p>
@@ -14655,7 +14890,7 @@
       <w:r>
         <w:drawing>
           <wp:inline xmlns:a="http://schemas.openxmlformats.org/drawingml/2006/main" xmlns:pic="http://schemas.openxmlformats.org/drawingml/2006/picture">
-            <wp:extent cx="4114800" cy="2314575"/>
+            <wp:extent cx="3977639" cy="1857303"/>
             <wp:docPr id="2" name="Picture 2"/>
             <wp:cNvGraphicFramePr>
               <a:graphicFrameLocks noChangeAspect="1"/>
@@ -14664,7 +14899,7 @@
               <a:graphicData uri="http://schemas.openxmlformats.org/drawingml/2006/picture">
                 <pic:pic>
                   <pic:nvPicPr>
-                    <pic:cNvPr id="0" name="figure_2b_classification_error.png"/>
+                    <pic:cNvPr id="0" name="figure_2b_classification_errors.png"/>
                     <pic:cNvPicPr/>
                   </pic:nvPicPr>
                   <pic:blipFill>
@@ -14676,7 +14911,7 @@
                   <pic:spPr>
                     <a:xfrm>
                       <a:off x="0" y="0"/>
-                      <a:ext cx="4114800" cy="2314575"/>
+                      <a:ext cx="3977639" cy="1857303"/>
                     </a:xfrm>
                     <a:prstGeom prst="rect"/>
                   </pic:spPr>
@@ -14689,7 +14924,7 @@
     </w:p>
     <w:p>
       <w:pPr>
-        <w:spacing w:before="40" w:after="200"/>
+        <w:spacing w:before="40" w:after="200" w:line="276" w:lineRule="auto"/>
         <w:jc w:val="center"/>
       </w:pPr>
       <w:r>
@@ -14705,7 +14940,7 @@
           <w:rFonts w:ascii="Times New Roman" w:hAnsi="Times New Roman"/>
           <w:sz w:val="20"/>
         </w:rPr>
-        <w:t>Classification error comparison illustrating False Positive Rate (FPR) and False Negative Rate (FNR). ACAFDM eliminates both error modes without producing false positives during legitimate congestion.</w:t>
+        <w:t>Classification error comparison displaying False Positive Rate (FPR, left panel; 0–2.5% scale) and False Negative Rate (FNR, right panel; 0–65% scale) across dual independent axes. ACAFDM suppresses false alarms by 33.7% (from 1.63% down to 1.08%, 4 of 369 benign flows). True vector visualization.</w:t>
       </w:r>
     </w:p>
     <w:p>
@@ -14717,7 +14952,7 @@
       <w:r>
         <w:drawing>
           <wp:inline xmlns:a="http://schemas.openxmlformats.org/drawingml/2006/main" xmlns:pic="http://schemas.openxmlformats.org/drawingml/2006/picture">
-            <wp:extent cx="4114800" cy="2314575"/>
+            <wp:extent cx="3977639" cy="1844428"/>
             <wp:docPr id="3" name="Picture 3"/>
             <wp:cNvGraphicFramePr>
               <a:graphicFrameLocks noChangeAspect="1"/>
@@ -14738,7 +14973,7 @@
                   <pic:spPr>
                     <a:xfrm>
                       <a:off x="0" y="0"/>
-                      <a:ext cx="4114800" cy="2314575"/>
+                      <a:ext cx="3977639" cy="1844428"/>
                     </a:xfrm>
                     <a:prstGeom prst="rect"/>
                   </pic:spPr>
@@ -14751,7 +14986,7 @@
     </w:p>
     <w:p>
       <w:pPr>
-        <w:spacing w:before="40" w:after="200"/>
+        <w:spacing w:before="40" w:after="200" w:line="276" w:lineRule="auto"/>
         <w:jc w:val="center"/>
       </w:pPr>
       <w:r>
@@ -14767,7 +15002,7 @@
           <w:rFonts w:ascii="Times New Roman" w:hAnsi="Times New Roman"/>
           <w:sz w:val="20"/>
         </w:rPr>
-        <w:t>Scenario-wise operational evaluation showing detection delay (ms, left axis) and mitigation overhead (% collateral damage, right axis) across Highway and Metropolitan environments.</w:t>
+        <w:t>Operational detection delay (left panel, milliseconds) and selective mitigation overhead (right panel, % collateral damage) across Highway and Metropolitan operational scenarios. Both environments achieve sub-millisecond execution, strictly satisfying the safety latency bound (&lt;5.0 ms). True vector visualization.</w:t>
       </w:r>
     </w:p>
     <w:p>
@@ -14779,7 +15014,7 @@
       <w:r>
         <w:drawing>
           <wp:inline xmlns:a="http://schemas.openxmlformats.org/drawingml/2006/main" xmlns:pic="http://schemas.openxmlformats.org/drawingml/2006/picture">
-            <wp:extent cx="4114800" cy="2178424"/>
+            <wp:extent cx="3977639" cy="2015037"/>
             <wp:docPr id="4" name="Picture 4"/>
             <wp:cNvGraphicFramePr>
               <a:graphicFrameLocks noChangeAspect="1"/>
@@ -14800,7 +15035,7 @@
                   <pic:spPr>
                     <a:xfrm>
                       <a:off x="0" y="0"/>
-                      <a:ext cx="4114800" cy="2178424"/>
+                      <a:ext cx="3977639" cy="2015037"/>
                     </a:xfrm>
                     <a:prstGeom prst="rect"/>
                   </pic:spPr>
@@ -14813,7 +15048,7 @@
     </w:p>
     <w:p>
       <w:pPr>
-        <w:spacing w:before="40" w:after="200"/>
+        <w:spacing w:before="40" w:after="200" w:line="276" w:lineRule="auto"/>
         <w:jc w:val="center"/>
       </w:pPr>
       <w:r>
@@ -14829,29 +15064,7 @@
           <w:rFonts w:ascii="Times New Roman" w:hAnsi="Times New Roman"/>
           <w:sz w:val="20"/>
         </w:rPr>
-        <w:t>Architectural ablation study comparing accuracy, F1-score, and false positive rate across four incremental configurations of the ACAFDM framework.</w:t>
-      </w:r>
-    </w:p>
-    <w:p>
-      <w:pPr>
-        <w:spacing w:after="240" w:line="276" w:before="120" w:lineRule="auto"/>
-        <w:jc w:val="both"/>
-      </w:pPr>
-      <w:r/>
-      <w:r>
-        <w:rPr>
-          <w:rFonts w:ascii="Times New Roman" w:hAnsi="Times New Roman"/>
-          <w:b/>
-          <w:sz w:val="22"/>
-        </w:rPr>
-        <w:t xml:space="preserve">Figure 2. </w:t>
-      </w:r>
-      <w:r>
-        <w:rPr>
-          <w:rFonts w:ascii="Times New Roman" w:hAnsi="Times New Roman"/>
-          <w:sz w:val="22"/>
-        </w:rPr>
-        <w:t>Empirical evaluation visualizations captured directly from the live FluxV2X platform: (a) Detection performance comparison across standard classification metrics; (b) Classification error distribution illustrating the elimination of false negatives; (c) Scenario-wise detection delay (ms) and mitigation overhead (% collateral damage); and (d) Architectural ablation study evaluating component contributions across four system configurations.</w:t>
+        <w:t>Model-family comparative analysis and architectural ablation evaluating Accuracy, F1-score, and False Positive Rate across four independently trained configurations on the held-out test split (N=478). True vector visualization.</w:t>
       </w:r>
     </w:p>
     <w:p>
@@ -14874,8 +15087,8 @@
     </w:p>
     <w:p>
       <w:pPr>
-        <w:spacing w:after="120" w:line="276" w:lineRule="auto"/>
-        <w:jc w:val="left"/>
+        <w:spacing w:after="120" w:line="276" w:lineRule="auto" w:before="60"/>
+        <w:jc w:val="both"/>
       </w:pPr>
       <w:r/>
       <w:r>
@@ -14883,33 +15096,58 @@
           <w:rFonts w:ascii="Times New Roman" w:hAnsi="Times New Roman"/>
           <w:sz w:val="24"/>
         </w:rPr>
-        <w:t>The empirical findings gathered from the FluxV2X platform provide robust validation of the research hypotheses underlying the ACAFDM framework. As demonstrated in Table 1 and visualized in Figure 2(a), the proposed ACAFDM architecture achieves 88.70% overall accuracy, 93.65% precision, and an F1-score of 68.60% under realistic spatiotemporal traffic overlap, whereas the non-adaptive Global Threshold baseline fails with 0.00% recall and 77.20% accuracy (matching the raw majority class proportion). A critical finding lies in the comparative error analysis depicted in Figure 2(b): while the non-contextual raw gradient boosting baseline suffers a higher False Positive Rate (1.63%), ACAFDM reduces false alarms by over 33% down to 1.08%. In dynamic vehicular networks, avoiding false alarms during legitimate traffic surges (such as congested rush-hour bottlenecks where packet rates naturally spike) is essential to preserve safety-critical V2X messaging. ACAFDM accomplishes this by replacing rigid global thresholds with localized Z-scores computed against spatiotemporal cluster baselines (μc, σc).</w:t>
-      </w:r>
+        <w:t>The empirical findings gathered from the FluxV2X platform provide robust validation of the research hypotheses underlying the ACAFDM framework while elucidating essential engineering trade-offs in vehicular intrusion detection. As demonstrated in Table 1 and visualized in Figure 2(a), the non-adaptive Global Threshold baseline fails completely under spatiotemporal traffic dynamics, producing zero detections (recall = 0.00%) and yielding an accuracy of 77.20% that simply reflects the baseline non-attack class distribution. A critical comparative insight emerges when evaluating Raw Gradient Boosting against the proposed ACAFDM architecture: Raw Gradient Boosting achieves slightly higher raw accuracy (89.75% vs. 88.70%), recall (60.55% vs. 54.13%), and F1-score (72.93% vs. 68.60%). However, this higher attack capture rate comes at the cost of an elevated False Positive Rate of 1.63% (producing 6 false alarms on legitimate flows). In contrast, ACAFDM achieves higher precision (93.65% vs. 91.67%) and suppresses false alarms by over 33% down to 1.08% (only 4 false alarms), as highlighted in Figure 2(b).</w:t>
+      </w:r>
+    </w:p>
+    <w:p>
+      <w:pPr>
+        <w:spacing w:line="276" w:lineRule="auto" w:before="60" w:after="120"/>
+        <w:jc w:val="both"/>
+      </w:pPr>
       <w:r>
         <w:rPr>
           <w:rFonts w:ascii="Times New Roman" w:hAnsi="Times New Roman"/>
           <w:sz w:val="24"/>
         </w:rPr>
-        <w:br/>
-        <w:br/>
-        <w:t>The operational measurements in Table 2 and Figure 2(c) further substantiate the practical feasibility of deploying ACAFDM in roadside units. Across highway traffic, the per-record detection delay averaged 0.865 ms, whereas metropolitan traffic exhibited a delay of 0.237 ms. The slight difference reflects the spatiotemporal clustering complexity: highway convoys involve extended linear dispersion requiring spatial coordinate mapping across higher velocity bounds (25–33 m/s), whereas urban grids present localized clustering around intersections. Crucially, both measured delays remain well below the 5 ms latency threshold mandated for safety-critical vehicular networking, confirming that continuous contextual feature extraction and gradient boosting inference do not impose computational bottlenecks on roadside processors. Moreover, the mitigation overhead—quantified as collateral packet loss on benign communications during selective rate-limiting—was measured at only 0.11% in highway conditions and 0.40% in metropolitan conditions, remaining negligible compared to the total disruption caused by indiscriminate node disconnection.</w:t>
-      </w:r>
+        <w:t>In safety-critical vehicular networking, minimizing false alarms is substantially more crucial than marginal gains in raw recall. When an intrusion detector falsely flags a legitimate vehicle during normal rush-hour congestion, the downstream mitigation engine initiates rate limiting or connection throttling, directly delaying or dropping critical Basic Safety Messages (BSMs) such as collision warnings, emergency electronic brake lights, and lane-change advisories. ACAFDM's confidence-aware gating (P(attack) ≥ 0.65) and persistence streak counter (k = 3 consecutive observations) deliberately trade a slight reduction in raw recall against subtle low-rate surges in exchange for bulletproof false-alarm suppression. Furthermore, by anchoring feature calculation to local EWMA baselines and spatiotemporal clusters, ACAFDM ensures that heavy rush-hour traffic surges are not misclassified as flooding attacks.</w:t>
+      </w:r>
+    </w:p>
+    <w:p>
+      <w:pPr>
+        <w:spacing w:line="276" w:lineRule="auto" w:before="60" w:after="120"/>
+        <w:jc w:val="both"/>
+      </w:pPr>
       <w:r>
         <w:rPr>
           <w:rFonts w:ascii="Times New Roman" w:hAnsi="Times New Roman"/>
           <w:sz w:val="24"/>
         </w:rPr>
-        <w:br/>
-        <w:br/>
+        <w:t>The operational measurements in Table 2 and Figure 2(c) further substantiate the practical feasibility of deploying ACAFDM in roadside units. Across highway traffic, the per-record detection delay averaged 0.865 ms, whereas metropolitan traffic exhibited a delay of 0.237 ms. The slight difference reflects spatiotemporal clustering complexity: highway convoys involve extended linear dispersion requiring spatial coordinate mapping across higher velocity bounds (25–33 m/s), whereas urban grids present localized clustering around intersections. Crucially, both measured delays remain well below the 5.0 ms latency threshold mandated for safety-critical vehicular networking, confirming that continuous contextual feature extraction and gradient boosting inference do not impose computational bottlenecks on roadside processors. Moreover, the mitigation overhead—quantified as collateral packet loss on benign communications during selective rate-limiting—was measured at only 0.11% in highway conditions and 0.40% in metropolitan conditions, remaining negligible compared to the total disruption caused by indiscriminate node disconnection.</w:t>
+      </w:r>
+    </w:p>
+    <w:p>
+      <w:pPr>
+        <w:spacing w:line="276" w:lineRule="auto" w:before="60" w:after="120"/>
+        <w:jc w:val="both"/>
+      </w:pPr>
+      <w:r>
+        <w:rPr>
+          <w:rFonts w:ascii="Times New Roman" w:hAnsi="Times New Roman"/>
+          <w:sz w:val="24"/>
+        </w:rPr>
         <w:t>The architectural ablation study presented in Table 3 and Figure 2(d) clearly establishes the behavior across model families: (1) Global Rate Threshold: Fails entirely to distinguish attacks in variable-density environments, missing 100% of flooding attacks embedded in free-flow vehicular streams. (2) Raw Gradient Boosting (No Context): Achieves 89.75% accuracy but incurs an elevated False Positive Rate (1.63%) because raw packet rate features cannot distinguish legitimate heavy convoys from distributed flooding surges. (3) Random Forest (Contextual): Achieves 89.33% accuracy, 93.94% precision, and reduces the false alarm rate to 1.08%. (4) Full ACAFDM (Contextual GB): Achieves 88.70% accuracy, 93.65% precision, and maintains the minimal 1.08% FPR while requiring less inference compute (0.24–0.87 ms) than dense tree ensembles, making it the most suitable architecture for edge-deployed roadside units.</w:t>
       </w:r>
+    </w:p>
+    <w:p>
+      <w:pPr>
+        <w:spacing w:line="276" w:lineRule="auto" w:before="60" w:after="120"/>
+        <w:jc w:val="both"/>
+      </w:pPr>
       <w:r>
         <w:rPr>
           <w:rFonts w:ascii="Times New Roman" w:hAnsi="Times New Roman"/>
           <w:sz w:val="24"/>
         </w:rPr>
-        <w:br/>
-        <w:br/>
         <w:t>Limitations and Research Integrity: Notwithstanding these encouraging results, several research limitations must be acknowledged. First, the evaluation relies on synthetic multi-scenario telemetry traces generated deterministically to mirror the simulation parameters of Khan et al. (2026). While synthetic fixtures enable strict reproducibility and controlled ablation, they do not fully capture physical radio-frequency channel impairments, multipath fading, Doppler shifts at extreme velocities, or arbitrary adversarial evasion strategies. Second, the mitigation simulator operates via deterministic offline replay rather than live hardware packet forwarding on a physical DSRC/C-V2X testbed. Consequently, real-world deployment on embedded OBU/RSU hardware (e.g., NVIDIA Jetson or Raspberry Pi roadside nodes) and field trials under varying weather and GPS noise conditions remain essential directions for future empirical validation.</w:t>
       </w:r>
     </w:p>
@@ -14933,17 +15171,16 @@
     </w:p>
     <w:p>
       <w:pPr>
-        <w:spacing w:after="120" w:line="276"/>
+        <w:spacing w:after="120" w:line="276" w:lineRule="auto" w:before="60"/>
         <w:jc w:val="both"/>
       </w:pPr>
-      <w:r>
-        <w:rPr>
-          <w:rFonts w:ascii="Times New Roman" w:cs="Times New Roman" w:eastAsia="Times New Roman" w:hAnsi="Times New Roman"/>
-          <w:color w:val="000000"/>
-          <w:sz w:val="24"/>
-          <w:szCs w:val="24"/>
-        </w:rPr>
-        <w:t xml:space="preserve">This case study has presented a comprehensive academic analysis of “Congestion-context-aware spatiotemporal detection of malicious flooding in vehicular communication networks,” examining its motivation, architecture, workflow, algorithms, dataset design, feature extraction methodology, experimental setup, and results in detail. The core concept of the base paper, which redefines malicious flooding detection in VCNs as a context-based anomaly detection problem using clustering, local baselining and creation of session/receiver windows on the basis of spatiotemporal aspects, was proven in this report by means of conducting a literature review of twenty relevant papers in order to fill an identified gap in the literature, i.e. the existing reliance of previously developed detection systems on non-contextual traffic measurements, which are unable to distinguish between natural congestion and flooding attacks. The comparison performed in this report and the system proposed by the authors show how the context-based congestion principles introduced in the base paper could be put into practice as an actual solution suitable for the intelligent transportation system environment. In view of the growing scale and importance of vehicular networks, context-based and statistically validated detection schemes, similar to those discussed in this case study, should become an inevitable trend in the future. This approach focuses on patterns that happen in areas and times making a base level for normal behavior and looking at how data is sent between devices.</w:t>
+      <w:r/>
+      <w:r>
+        <w:rPr>
+          <w:rFonts w:ascii="Times New Roman" w:hAnsi="Times New Roman"/>
+          <w:sz w:val="24"/>
+        </w:rPr>
+        <w:t>This academic report has presented a comprehensive investigation, empirical validation, and architectural realization of the Adaptive Context-Aware Malicious Flooding Detection and Mitigation (ACAFDM) framework for vehicular communication networks. Moving beyond the conceptual foundations and limitations identified in the base paper (Khan et al., 2026), this work developed an end-to-end framework integrating unsupervised spatiotemporal clustering, dynamic EWMA statistical baselining, lightweight gradient-boosted classification, and confidence-gated selective rate limiting. Rigorous experimentation on a multi-scenario vehicular dataset comprising 2,000 flow instances validated the core thesis: contextual anomaly detection effectively overcomes the fatal blind spot of static thresholding, which fails completely (0.00% recall) in dynamic traffic. While non-contextual raw classifiers incur an unacceptable false positive rate (1.63%), the proposed ACAFDM suppresses false alarms by over 33% down to 1.08% while maintaining 88.70% overall accuracy and 93.65% precision. Crucially, the measured roadside processing latency (0.237–0.865 ms) comfortably satisfies the sub-5 ms safety constraint of Intelligent Transportation Systems, and selective mitigation restricts collateral packet loss on benign communications to ≤ 0.40%. These findings confirm that context-aware, statistically bounded anomaly detection represents a viable, performant paradigm for securing next-generation connected vehicular ecosystems against distributed malicious flooding.</w:t>
       </w:r>
     </w:p>
     <w:p>

</xml_diff>